<commit_message>
doc/fundamentacao teorica react e api
</commit_message>
<xml_diff>
--- a/reportai-docs/Reportaí.docx
+++ b/reportai-docs/Reportaí.docx
@@ -3285,7 +3285,7 @@
           <w:noProof/>
         </w:rPr>
         <w:drawing>
-          <wp:anchor distT="0" distB="0" distL="0" distR="0" simplePos="0" relativeHeight="251657216" behindDoc="0" locked="0" layoutInCell="1" allowOverlap="0" wp14:anchorId="73651F8C" wp14:editId="63D14BDE">
+          <wp:anchor distT="0" distB="0" distL="0" distR="0" simplePos="0" relativeHeight="251657216" behindDoc="0" locked="0" layoutInCell="1" allowOverlap="0" wp14:anchorId="73651F8C" wp14:editId="2D67B8F8">
             <wp:simplePos x="0" y="0"/>
             <wp:positionH relativeFrom="column">
               <wp:posOffset>56515</wp:posOffset>
@@ -3386,7 +3386,7 @@
           <w:noProof/>
         </w:rPr>
         <w:drawing>
-          <wp:anchor distT="0" distB="0" distL="0" distR="0" simplePos="0" relativeHeight="251658240" behindDoc="0" locked="0" layoutInCell="1" allowOverlap="0" wp14:anchorId="65BDD473" wp14:editId="456C38F1">
+          <wp:anchor distT="0" distB="0" distL="0" distR="0" simplePos="0" relativeHeight="251658240" behindDoc="0" locked="0" layoutInCell="1" allowOverlap="0" wp14:anchorId="65BDD473" wp14:editId="17D6FAFF">
             <wp:simplePos x="0" y="0"/>
             <wp:positionH relativeFrom="column">
               <wp:posOffset>50165</wp:posOffset>
@@ -5669,41 +5669,205 @@
     <w:p/>
     <w:p>
       <w:pPr>
-        <w:spacing w:line="240" w:lineRule="auto"/>
-        <w:ind w:firstLine="0"/>
-        <w:jc w:val="left"/>
-      </w:pPr>
-      <w:r>
-        <w:t>(mas linguagem crua não é suficiente) frameworks</w:t>
-      </w:r>
-    </w:p>
-    <w:p>
-      <w:pPr>
-        <w:spacing w:line="240" w:lineRule="auto"/>
-        <w:ind w:firstLine="0"/>
-        <w:jc w:val="left"/>
-      </w:pPr>
-      <w:r>
-        <w:tab/>
-      </w:r>
-      <w:r>
-        <w:tab/>
-        <w:t xml:space="preserve">1. </w:t>
+        <w:pStyle w:val="Ttulo4"/>
+      </w:pPr>
+      <w:r>
+        <w:t xml:space="preserve"> Java Spring</w:t>
+      </w:r>
+    </w:p>
+    <w:p>
+      <w:r>
+        <w:t xml:space="preserve">Java Spring </w:t>
+      </w:r>
+      <w:r>
+        <w:t xml:space="preserve">é um framework </w:t>
       </w:r>
       <w:proofErr w:type="spellStart"/>
       <w:r>
-        <w:t>java</w:t>
+        <w:t>que oferece</w:t>
       </w:r>
       <w:proofErr w:type="spellEnd"/>
       <w:r>
+        <w:t xml:space="preserve"> suporte ao padrão MVC, fornece funcionalidades para </w:t>
+      </w:r>
+      <w:proofErr w:type="spellStart"/>
+      <w:r>
+        <w:t>RESTful</w:t>
+      </w:r>
+      <w:proofErr w:type="spellEnd"/>
+      <w:r>
+        <w:t xml:space="preserve"> Web Services, e inclui uma conexão de banco de dados no pacote. Ele também suporta injeção de dependência, o que facilita a configuração de dependências na aplicação</w:t>
+      </w:r>
+      <w:r>
+        <w:t xml:space="preserve"> (</w:t>
+      </w:r>
+      <w:r>
+        <w:t>HATMA</w:t>
+      </w:r>
+      <w:r>
+        <w:t xml:space="preserve">, 2017). Por esses motivos, Java Spring foi escolhido para construir o </w:t>
+      </w:r>
+      <w:proofErr w:type="spellStart"/>
+      <w:r>
+        <w:t>back-end</w:t>
+      </w:r>
+      <w:proofErr w:type="spellEnd"/>
+      <w:r>
+        <w:t xml:space="preserve"> do sistema.</w:t>
+      </w:r>
+    </w:p>
+    <w:p/>
+    <w:p>
+      <w:pPr>
+        <w:pStyle w:val="Ttulo4"/>
+      </w:pPr>
+      <w:r>
         <w:t xml:space="preserve"> </w:t>
       </w:r>
       <w:proofErr w:type="spellStart"/>
       <w:r>
-        <w:t>spring</w:t>
+        <w:t>ReactJS</w:t>
       </w:r>
       <w:proofErr w:type="spellEnd"/>
     </w:p>
+    <w:p>
+      <w:r>
+        <w:t xml:space="preserve">O </w:t>
+      </w:r>
+      <w:proofErr w:type="spellStart"/>
+      <w:r>
+        <w:t>ReactJS</w:t>
+      </w:r>
+      <w:proofErr w:type="spellEnd"/>
+      <w:r>
+        <w:t xml:space="preserve">, ou só </w:t>
+      </w:r>
+      <w:proofErr w:type="spellStart"/>
+      <w:r>
+        <w:t>React</w:t>
+      </w:r>
+      <w:proofErr w:type="spellEnd"/>
+      <w:r>
+        <w:t>,</w:t>
+      </w:r>
+      <w:r>
+        <w:t xml:space="preserve"> é uma biblioteca de código aberto que é utilizada para construir interfaces de usuário</w:t>
+      </w:r>
+      <w:r>
+        <w:t>.</w:t>
+      </w:r>
+      <w:r>
+        <w:t xml:space="preserve"> O </w:t>
+      </w:r>
+      <w:proofErr w:type="spellStart"/>
+      <w:r>
+        <w:t>Reac</w:t>
+      </w:r>
+      <w:r>
+        <w:t>t</w:t>
+      </w:r>
+      <w:proofErr w:type="spellEnd"/>
+      <w:r>
+        <w:t xml:space="preserve"> permite que programadores criem grandes aplicações web que podem mudar ao longo do tempo sem precisar recarregar a página</w:t>
+      </w:r>
+      <w:r>
+        <w:t xml:space="preserve">, resultando em uma navegação mais fluída para o usuário. </w:t>
+      </w:r>
+      <w:r>
+        <w:t>(</w:t>
+      </w:r>
+      <w:r>
+        <w:t>RAWAT</w:t>
+      </w:r>
+      <w:r>
+        <w:t xml:space="preserve">, </w:t>
+      </w:r>
+      <w:r>
+        <w:t>2020</w:t>
+      </w:r>
+      <w:r>
+        <w:t>)</w:t>
+      </w:r>
+    </w:p>
+    <w:p/>
+    <w:p>
+      <w:pPr>
+        <w:pStyle w:val="Ttulo3"/>
+      </w:pPr>
+      <w:r>
+        <w:t xml:space="preserve"> API</w:t>
+      </w:r>
+    </w:p>
+    <w:p>
+      <w:r>
+        <w:t xml:space="preserve">A comunicação entre o </w:t>
+      </w:r>
+      <w:proofErr w:type="spellStart"/>
+      <w:r>
+        <w:t>front-end</w:t>
+      </w:r>
+      <w:proofErr w:type="spellEnd"/>
+      <w:r>
+        <w:t xml:space="preserve"> da aplicação e o </w:t>
+      </w:r>
+      <w:proofErr w:type="spellStart"/>
+      <w:r>
+        <w:t>back-end</w:t>
+      </w:r>
+      <w:proofErr w:type="spellEnd"/>
+      <w:r>
+        <w:t>, assim como a comunicação com sistemas externos</w:t>
+      </w:r>
+      <w:r>
+        <w:t>, ocorre via API.</w:t>
+      </w:r>
+      <w:r>
+        <w:t xml:space="preserve"> </w:t>
+      </w:r>
+      <w:r>
+        <w:t>API significa interface de programação de aplicações. Uma API ajuda a expor um serviço de negócio ou um ativo empresarial para os desenvolvedores que estão criando uma aplicação</w:t>
+      </w:r>
+      <w:r>
+        <w:t xml:space="preserve"> (</w:t>
+      </w:r>
+      <w:r>
+        <w:t>DE</w:t>
+      </w:r>
+      <w:r>
+        <w:t xml:space="preserve">, 2017). </w:t>
+      </w:r>
+      <w:r>
+        <w:t>Uma interface pode ser entendida como um acordo de serviço entre duas aplicações, estabelecendo as regras para a comunicação entre elas por meio de solicitações e respostas. A documentação das respectivas APIs fornece detalhes sobre como os desenvolvedores devem organizar essas solicitações e respostas.</w:t>
+      </w:r>
+      <w:r>
+        <w:t xml:space="preserve"> (AMAZON, 2024).</w:t>
+      </w:r>
+    </w:p>
+    <w:p>
+      <w:pPr>
+        <w:pStyle w:val="Ttulo4"/>
+      </w:pPr>
+      <w:r>
+        <w:t xml:space="preserve"> HTTP</w:t>
+      </w:r>
+    </w:p>
+    <w:p>
+      <w:pPr>
+        <w:pStyle w:val="Ttulo4"/>
+      </w:pPr>
+      <w:r>
+        <w:t xml:space="preserve"> REST</w:t>
+      </w:r>
+    </w:p>
+    <w:p>
+      <w:pPr>
+        <w:pStyle w:val="Ttulo4"/>
+      </w:pPr>
+      <w:r>
+        <w:t xml:space="preserve"> API mapa</w:t>
+      </w:r>
+    </w:p>
+    <w:p/>
     <w:p>
       <w:pPr>
         <w:spacing w:line="240" w:lineRule="auto"/>
@@ -5741,6 +5905,7 @@
         <w:jc w:val="left"/>
       </w:pPr>
       <w:r>
+        <w:lastRenderedPageBreak/>
         <w:tab/>
         <w:t>7. (para se comunicar com API) REST</w:t>
       </w:r>
@@ -6996,6 +7161,7 @@
       <w:pPr>
         <w:rPr>
           <w:szCs w:val="24"/>
+          <w:lang w:val="en-US"/>
         </w:rPr>
       </w:pPr>
       <w:r>
@@ -7010,12 +7176,20 @@
         <w:rPr>
           <w:szCs w:val="24"/>
         </w:rPr>
-        <w:t xml:space="preserve"> Criando sites com HTML: sites de alta qualidade com HTML e CSS. São Paulo: </w:t>
+        <w:t xml:space="preserve"> Criando sites com HTML: sites de alta qualidade com HTML e CSS. </w:t>
+      </w:r>
+      <w:r>
+        <w:rPr>
+          <w:szCs w:val="24"/>
+          <w:lang w:val="en-US"/>
+        </w:rPr>
+        <w:t xml:space="preserve">São Paulo: </w:t>
       </w:r>
       <w:proofErr w:type="spellStart"/>
       <w:r>
         <w:rPr>
           <w:szCs w:val="24"/>
+          <w:lang w:val="en-US"/>
         </w:rPr>
         <w:t>Novatec</w:t>
       </w:r>
@@ -7023,14 +7197,32 @@
       <w:r>
         <w:rPr>
           <w:szCs w:val="24"/>
-        </w:rPr>
-        <w:t xml:space="preserve"> Editora, 2008.</w:t>
-      </w:r>
-    </w:p>
-    <w:p>
-      <w:pPr>
-        <w:rPr>
-          <w:szCs w:val="24"/>
+          <w:lang w:val="en-US"/>
+        </w:rPr>
+        <w:t xml:space="preserve"> </w:t>
+      </w:r>
+      <w:proofErr w:type="spellStart"/>
+      <w:r>
+        <w:rPr>
+          <w:szCs w:val="24"/>
+          <w:lang w:val="en-US"/>
+        </w:rPr>
+        <w:t>Editora</w:t>
+      </w:r>
+      <w:proofErr w:type="spellEnd"/>
+      <w:r>
+        <w:rPr>
+          <w:szCs w:val="24"/>
+          <w:lang w:val="en-US"/>
+        </w:rPr>
+        <w:t>, 2008.</w:t>
+      </w:r>
+    </w:p>
+    <w:p>
+      <w:pPr>
+        <w:rPr>
+          <w:szCs w:val="24"/>
+          <w:lang w:val="en-US"/>
         </w:rPr>
       </w:pPr>
       <w:r>
@@ -7075,12 +7267,181 @@
         <w:rPr>
           <w:szCs w:val="24"/>
         </w:rPr>
-        <w:t>. Acesso em: 2 set. 2024.</w:t>
+        <w:t xml:space="preserve">. </w:t>
+      </w:r>
+      <w:proofErr w:type="spellStart"/>
+      <w:r>
+        <w:rPr>
+          <w:szCs w:val="24"/>
+          <w:lang w:val="en-US"/>
+        </w:rPr>
+        <w:t>Acesso</w:t>
+      </w:r>
+      <w:proofErr w:type="spellEnd"/>
+      <w:r>
+        <w:rPr>
+          <w:szCs w:val="24"/>
+          <w:lang w:val="en-US"/>
+        </w:rPr>
+        <w:t xml:space="preserve"> </w:t>
+      </w:r>
+      <w:proofErr w:type="spellStart"/>
+      <w:r>
+        <w:rPr>
+          <w:szCs w:val="24"/>
+          <w:lang w:val="en-US"/>
+        </w:rPr>
+        <w:t>em</w:t>
+      </w:r>
+      <w:proofErr w:type="spellEnd"/>
+      <w:r>
+        <w:rPr>
+          <w:szCs w:val="24"/>
+          <w:lang w:val="en-US"/>
+        </w:rPr>
+        <w:t>: 2 set. 2024.</w:t>
+      </w:r>
+    </w:p>
+    <w:p>
+      <w:pPr>
+        <w:rPr>
+          <w:szCs w:val="24"/>
+        </w:rPr>
+      </w:pPr>
+      <w:r>
+        <w:rPr>
+          <w:szCs w:val="24"/>
+          <w:lang w:val="en-US"/>
+        </w:rPr>
+        <w:t xml:space="preserve">HATMA, S.; DEDY, P. J.; ARIS, T. Design and Development of Backend Application for Public Complaint Systems Using Microservice Spring Boot. </w:t>
+      </w:r>
+      <w:r>
+        <w:rPr>
+          <w:i/>
+          <w:iCs/>
+          <w:szCs w:val="24"/>
+        </w:rPr>
+        <w:t>Procedia Computer Science</w:t>
+      </w:r>
+      <w:r>
+        <w:rPr>
+          <w:szCs w:val="24"/>
+        </w:rPr>
+        <w:t>, v. 124, p. 736-743, 2017.</w:t>
+      </w:r>
+    </w:p>
+    <w:p>
+      <w:pPr>
+        <w:rPr>
+          <w:szCs w:val="24"/>
+        </w:rPr>
+      </w:pPr>
+      <w:r>
+        <w:rPr>
+          <w:szCs w:val="24"/>
+          <w:lang w:val="en-US"/>
+        </w:rPr>
+        <w:t xml:space="preserve">RAWAT, Prateek; MAHAJAN, Archana N. ReactJS: A Modern Web Development Framework. </w:t>
+      </w:r>
+      <w:r>
+        <w:rPr>
+          <w:b/>
+          <w:bCs/>
+          <w:szCs w:val="24"/>
+          <w:lang w:val="en-US"/>
+        </w:rPr>
+        <w:t>International Journal of Innovative Science and Research Technology</w:t>
+      </w:r>
+      <w:r>
+        <w:rPr>
+          <w:szCs w:val="24"/>
+          <w:lang w:val="en-US"/>
+        </w:rPr>
+        <w:t xml:space="preserve">, v. 5, n. 11, p. 698, </w:t>
+      </w:r>
+      <w:proofErr w:type="spellStart"/>
+      <w:r>
+        <w:rPr>
+          <w:szCs w:val="24"/>
+          <w:lang w:val="en-US"/>
+        </w:rPr>
+        <w:t>nov.</w:t>
+      </w:r>
+      <w:proofErr w:type="spellEnd"/>
+      <w:r>
+        <w:rPr>
+          <w:szCs w:val="24"/>
+          <w:lang w:val="en-US"/>
+        </w:rPr>
+        <w:t xml:space="preserve"> 2020. </w:t>
+      </w:r>
+      <w:r>
+        <w:rPr>
+          <w:szCs w:val="24"/>
+        </w:rPr>
+        <w:t xml:space="preserve">Disponível em: </w:t>
+      </w:r>
+      <w:hyperlink r:id="rId28" w:tgtFrame="_new" w:history="1">
+        <w:r>
+          <w:rPr>
+            <w:rStyle w:val="Hyperlink"/>
+            <w:szCs w:val="24"/>
+          </w:rPr>
+          <w:t>www.ijisrt.com</w:t>
+        </w:r>
+      </w:hyperlink>
+      <w:r>
+        <w:rPr>
+          <w:szCs w:val="24"/>
+        </w:rPr>
+        <w:t>. ISSN 2456-2165.</w:t>
+      </w:r>
+    </w:p>
+    <w:p>
+      <w:pPr>
+        <w:rPr>
+          <w:szCs w:val="24"/>
+        </w:rPr>
+      </w:pPr>
+      <w:r>
+        <w:rPr>
+          <w:szCs w:val="24"/>
+        </w:rPr>
+        <w:t xml:space="preserve">AMAZON WEB SERVICES. O que é uma </w:t>
+      </w:r>
+      <w:proofErr w:type="gramStart"/>
+      <w:r>
+        <w:rPr>
+          <w:szCs w:val="24"/>
+        </w:rPr>
+        <w:t>API?.</w:t>
+      </w:r>
+      <w:proofErr w:type="gramEnd"/>
+      <w:r>
+        <w:rPr>
+          <w:szCs w:val="24"/>
+        </w:rPr>
+        <w:t xml:space="preserve"> Disponível em: </w:t>
+      </w:r>
+      <w:hyperlink r:id="rId29" w:tgtFrame="_new" w:history="1">
+        <w:r>
+          <w:rPr>
+            <w:rStyle w:val="Hyperlink"/>
+            <w:szCs w:val="24"/>
+          </w:rPr>
+          <w:t>https://aws.amazon.com/pt/what-is/api/</w:t>
+        </w:r>
+      </w:hyperlink>
+      <w:r>
+        <w:rPr>
+          <w:szCs w:val="24"/>
+        </w:rPr>
+        <w:t>. Acesso em: 3 set. 2024.</w:t>
       </w:r>
     </w:p>
     <w:sectPr>
-      <w:headerReference w:type="even" r:id="rId28"/>
-      <w:headerReference w:type="default" r:id="rId29"/>
+      <w:headerReference w:type="even" r:id="rId30"/>
+      <w:headerReference w:type="default" r:id="rId31"/>
       <w:type w:val="oddPage"/>
       <w:pgSz w:w="11907" w:h="16840" w:code="9"/>
       <w:pgMar w:top="1701" w:right="1134" w:bottom="1134" w:left="1701" w:header="1134" w:footer="1134" w:gutter="0"/>
@@ -10553,10 +10914,6 @@
 </file>
 
 <file path=customXml/item1.xml><?xml version="1.0" encoding="utf-8"?>
-<b:Sources xmlns:b="http://schemas.openxmlformats.org/officeDocument/2006/bibliography" xmlns="http://schemas.openxmlformats.org/officeDocument/2006/bibliography" SelectedStyle="\GB.XSL" StyleName="GB7714"/>
-</file>
-
-<file path=customXml/item2.xml><?xml version="1.0" encoding="utf-8"?>
 <?mso-contentType ?>
 <FormTemplates xmlns="http://schemas.microsoft.com/sharepoint/v3/contenttype/forms">
   <Display>DocumentLibraryForm</Display>
@@ -10565,17 +10922,11 @@
 </FormTemplates>
 </file>
 
-<file path=customXml/item3.xml><?xml version="1.0" encoding="utf-8"?>
-<p:properties xmlns:p="http://schemas.microsoft.com/office/2006/metadata/properties" xmlns:xsi="http://www.w3.org/2001/XMLSchema-instance" xmlns:pc="http://schemas.microsoft.com/office/infopath/2007/PartnerControls">
-  <documentManagement>
-    <_ip_UnifiedCompliancePolicyUIAction xmlns="http://schemas.microsoft.com/sharepoint/v3" xsi:nil="true"/>
-    <_ip_UnifiedCompliancePolicyProperties xmlns="http://schemas.microsoft.com/sharepoint/v3" xsi:nil="true"/>
-    <_activity xmlns="dc236bd3-22a1-40fd-b120-f4bf2cfb02e5" xsi:nil="true"/>
-  </documentManagement>
-</p:properties>
+<file path=customXml/item2.xml><?xml version="1.0" encoding="utf-8"?>
+<b:Sources xmlns:b="http://schemas.openxmlformats.org/officeDocument/2006/bibliography" xmlns="http://schemas.openxmlformats.org/officeDocument/2006/bibliography" SelectedStyle="\GB.XSL" StyleName="GB7714"/>
 </file>
 
-<file path=customXml/item4.xml><?xml version="1.0" encoding="utf-8"?>
+<file path=customXml/item3.xml><?xml version="1.0" encoding="utf-8"?>
 <ct:contentTypeSchema xmlns:ct="http://schemas.microsoft.com/office/2006/metadata/contentType" xmlns:ma="http://schemas.microsoft.com/office/2006/metadata/properties/metaAttributes" ct:_="" ma:_="" ma:contentTypeName="Documento" ma:contentTypeID="0x0101009A9245E7D933DB48BB9689B768D8465E" ma:contentTypeVersion="20" ma:contentTypeDescription="Crie um novo documento." ma:contentTypeScope="" ma:versionID="c310dbd2fa624fda04c8bc918a8b03ac">
   <xsd:schema xmlns:xsd="http://www.w3.org/2001/XMLSchema" xmlns:xs="http://www.w3.org/2001/XMLSchema" xmlns:p="http://schemas.microsoft.com/office/2006/metadata/properties" xmlns:ns1="http://schemas.microsoft.com/sharepoint/v3" xmlns:ns3="dc236bd3-22a1-40fd-b120-f4bf2cfb02e5" xmlns:ns4="9d3905d4-f008-4ae0-8ecf-c0fcf643c7ce" targetNamespace="http://schemas.microsoft.com/office/2006/metadata/properties" ma:root="true" ma:fieldsID="12efab61f20a256d51c72f88e5f31734" ns1:_="" ns3:_="" ns4:_="">
     <xsd:import namespace="http://schemas.microsoft.com/sharepoint/v3"/>
@@ -10845,7 +11196,25 @@
 </ct:contentTypeSchema>
 </file>
 
+<file path=customXml/item4.xml><?xml version="1.0" encoding="utf-8"?>
+<p:properties xmlns:p="http://schemas.microsoft.com/office/2006/metadata/properties" xmlns:xsi="http://www.w3.org/2001/XMLSchema-instance" xmlns:pc="http://schemas.microsoft.com/office/infopath/2007/PartnerControls">
+  <documentManagement>
+    <_ip_UnifiedCompliancePolicyUIAction xmlns="http://schemas.microsoft.com/sharepoint/v3" xsi:nil="true"/>
+    <_ip_UnifiedCompliancePolicyProperties xmlns="http://schemas.microsoft.com/sharepoint/v3" xsi:nil="true"/>
+    <_activity xmlns="dc236bd3-22a1-40fd-b120-f4bf2cfb02e5" xsi:nil="true"/>
+  </documentManagement>
+</p:properties>
+</file>
+
 <file path=customXml/itemProps1.xml><?xml version="1.0" encoding="utf-8"?>
+<ds:datastoreItem xmlns:ds="http://schemas.openxmlformats.org/officeDocument/2006/customXml" ds:itemID="{D0EF6655-36F8-4AE8-80E8-8843D0BE3BB0}">
+  <ds:schemaRefs>
+    <ds:schemaRef ds:uri="http://schemas.microsoft.com/sharepoint/v3/contenttype/forms"/>
+  </ds:schemaRefs>
+</ds:datastoreItem>
+</file>
+
+<file path=customXml/itemProps2.xml><?xml version="1.0" encoding="utf-8"?>
 <ds:datastoreItem xmlns:ds="http://schemas.openxmlformats.org/officeDocument/2006/customXml" ds:itemID="{D5E71C61-0628-4013-9296-50A26E5B5C0D}">
   <ds:schemaRefs>
     <ds:schemaRef ds:uri="http://schemas.openxmlformats.org/officeDocument/2006/bibliography"/>
@@ -10853,33 +11222,7 @@
 </ds:datastoreItem>
 </file>
 
-<file path=customXml/itemProps2.xml><?xml version="1.0" encoding="utf-8"?>
-<ds:datastoreItem xmlns:ds="http://schemas.openxmlformats.org/officeDocument/2006/customXml" ds:itemID="{D0EF6655-36F8-4AE8-80E8-8843D0BE3BB0}">
-  <ds:schemaRefs>
-    <ds:schemaRef ds:uri="http://schemas.microsoft.com/sharepoint/v3/contenttype/forms"/>
-  </ds:schemaRefs>
-</ds:datastoreItem>
-</file>
-
 <file path=customXml/itemProps3.xml><?xml version="1.0" encoding="utf-8"?>
-<ds:datastoreItem xmlns:ds="http://schemas.openxmlformats.org/officeDocument/2006/customXml" ds:itemID="{74AD157C-1D73-4DC2-B2B5-0CA82C9C3AED}">
-  <ds:schemaRefs>
-    <ds:schemaRef ds:uri="dc236bd3-22a1-40fd-b120-f4bf2cfb02e5"/>
-    <ds:schemaRef ds:uri="http://schemas.microsoft.com/sharepoint/v3"/>
-    <ds:schemaRef ds:uri="http://purl.org/dc/elements/1.1/"/>
-    <ds:schemaRef ds:uri="http://purl.org/dc/dcmitype/"/>
-    <ds:schemaRef ds:uri="http://schemas.openxmlformats.org/package/2006/metadata/core-properties"/>
-    <ds:schemaRef ds:uri="http://schemas.microsoft.com/office/2006/metadata/properties"/>
-    <ds:schemaRef ds:uri="http://schemas.microsoft.com/office/2006/documentManagement/types"/>
-    <ds:schemaRef ds:uri="9d3905d4-f008-4ae0-8ecf-c0fcf643c7ce"/>
-    <ds:schemaRef ds:uri="http://www.w3.org/XML/1998/namespace"/>
-    <ds:schemaRef ds:uri="http://schemas.microsoft.com/office/infopath/2007/PartnerControls"/>
-    <ds:schemaRef ds:uri="http://purl.org/dc/terms/"/>
-  </ds:schemaRefs>
-</ds:datastoreItem>
-</file>
-
-<file path=customXml/itemProps4.xml><?xml version="1.0" encoding="utf-8"?>
 <ds:datastoreItem xmlns:ds="http://schemas.openxmlformats.org/officeDocument/2006/customXml" ds:itemID="{9F3B7632-F9B1-4F20-B6CF-16E183EBD773}">
   <ds:schemaRefs>
     <ds:schemaRef ds:uri="http://schemas.microsoft.com/office/2006/metadata/contentType"/>
@@ -10897,4 +11240,22 @@
     <ds:schemaRef ds:uri="http://schemas.microsoft.com/internal/obd"/>
   </ds:schemaRefs>
 </ds:datastoreItem>
+</file>
+
+<file path=customXml/itemProps4.xml><?xml version="1.0" encoding="utf-8"?>
+<ds:datastoreItem xmlns:ds="http://schemas.openxmlformats.org/officeDocument/2006/customXml" ds:itemID="{74AD157C-1D73-4DC2-B2B5-0CA82C9C3AED}">
+  <ds:schemaRefs>
+    <ds:schemaRef ds:uri="http://purl.org/dc/elements/1.1/"/>
+    <ds:schemaRef ds:uri="http://schemas.microsoft.com/office/2006/documentManagement/types"/>
+    <ds:schemaRef ds:uri="http://schemas.openxmlformats.org/package/2006/metadata/core-properties"/>
+    <ds:schemaRef ds:uri="http://schemas.microsoft.com/office/2006/metadata/properties"/>
+    <ds:schemaRef ds:uri="http://schemas.microsoft.com/office/infopath/2007/PartnerControls"/>
+    <ds:schemaRef ds:uri="http://purl.org/dc/terms/"/>
+    <ds:schemaRef ds:uri="9d3905d4-f008-4ae0-8ecf-c0fcf643c7ce"/>
+    <ds:schemaRef ds:uri="http://purl.org/dc/dcmitype/"/>
+    <ds:schemaRef ds:uri="http://www.w3.org/XML/1998/namespace"/>
+    <ds:schemaRef ds:uri="dc236bd3-22a1-40fd-b120-f4bf2cfb02e5"/>
+    <ds:schemaRef ds:uri="http://schemas.microsoft.com/sharepoint/v3"/>
+  </ds:schemaRefs>
+</ds:datastoreItem>
 </file>
</xml_diff>

<commit_message>
doc/api mapas e biblioteca
</commit_message>
<xml_diff>
--- a/reportai-docs/Reportaí.docx
+++ b/reportai-docs/Reportaí.docx
@@ -21,16 +21,8 @@
         <w:rPr>
           <w:szCs w:val="24"/>
         </w:rPr>
-        <w:t xml:space="preserve"> SENAC </w:t>
-      </w:r>
-      <w:proofErr w:type="gramStart"/>
-      <w:r>
-        <w:rPr>
-          <w:szCs w:val="24"/>
-        </w:rPr>
-        <w:t>–  FLORIANÓPOLIS</w:t>
-      </w:r>
-      <w:proofErr w:type="gramEnd"/>
+        <w:t xml:space="preserve"> SENAC –  FLORIANÓPOLIS</w:t>
+      </w:r>
     </w:p>
     <w:p>
       <w:pPr>
@@ -183,7 +175,6 @@
           <w:szCs w:val="24"/>
         </w:rPr>
       </w:pPr>
-      <w:proofErr w:type="spellStart"/>
       <w:r>
         <w:rPr>
           <w:b/>
@@ -192,7 +183,6 @@
         </w:rPr>
         <w:t>Reportaí</w:t>
       </w:r>
-      <w:proofErr w:type="spellEnd"/>
       <w:r>
         <w:rPr>
           <w:b/>
@@ -571,7 +561,6 @@
           <w:szCs w:val="24"/>
         </w:rPr>
       </w:pPr>
-      <w:proofErr w:type="spellStart"/>
       <w:r>
         <w:rPr>
           <w:b/>
@@ -580,7 +569,6 @@
         </w:rPr>
         <w:t>Reportaí</w:t>
       </w:r>
-      <w:proofErr w:type="spellEnd"/>
       <w:r>
         <w:rPr>
           <w:b/>
@@ -690,43 +678,7 @@
           <w:sz w:val="20"/>
           <w:szCs w:val="20"/>
         </w:rPr>
-        <w:t xml:space="preserve">Orientadora: Profa. </w:t>
-      </w:r>
-      <w:proofErr w:type="spellStart"/>
-      <w:r>
-        <w:rPr>
-          <w:color w:val="000000"/>
-          <w:sz w:val="20"/>
-          <w:szCs w:val="20"/>
-        </w:rPr>
-        <w:t>Msc</w:t>
-      </w:r>
-      <w:proofErr w:type="spellEnd"/>
-      <w:r>
-        <w:rPr>
-          <w:color w:val="000000"/>
-          <w:sz w:val="20"/>
-          <w:szCs w:val="20"/>
-        </w:rPr>
-        <w:t xml:space="preserve">. </w:t>
-      </w:r>
-      <w:proofErr w:type="spellStart"/>
-      <w:r>
-        <w:rPr>
-          <w:color w:val="000000"/>
-          <w:sz w:val="20"/>
-          <w:szCs w:val="20"/>
-        </w:rPr>
-        <w:t>Thayse</w:t>
-      </w:r>
-      <w:proofErr w:type="spellEnd"/>
-      <w:r>
-        <w:rPr>
-          <w:color w:val="000000"/>
-          <w:sz w:val="20"/>
-          <w:szCs w:val="20"/>
-        </w:rPr>
-        <w:t xml:space="preserve"> Christine da Silva</w:t>
+        <w:t>Orientadora: Profa. Msc. Thayse Christine da Silva</w:t>
       </w:r>
     </w:p>
     <w:p>
@@ -742,43 +694,7 @@
           <w:sz w:val="20"/>
           <w:szCs w:val="20"/>
         </w:rPr>
-        <w:t xml:space="preserve">Coorientador: Prof. </w:t>
-      </w:r>
-      <w:proofErr w:type="spellStart"/>
-      <w:r>
-        <w:rPr>
-          <w:color w:val="000000"/>
-          <w:sz w:val="20"/>
-          <w:szCs w:val="20"/>
-        </w:rPr>
-        <w:t>Msc</w:t>
-      </w:r>
-      <w:proofErr w:type="spellEnd"/>
-      <w:r>
-        <w:rPr>
-          <w:color w:val="000000"/>
-          <w:sz w:val="20"/>
-          <w:szCs w:val="20"/>
-        </w:rPr>
-        <w:t xml:space="preserve">. </w:t>
-      </w:r>
-      <w:proofErr w:type="spellStart"/>
-      <w:r>
-        <w:rPr>
-          <w:color w:val="000000"/>
-          <w:sz w:val="20"/>
-          <w:szCs w:val="20"/>
-        </w:rPr>
-        <w:t>Myagyh</w:t>
-      </w:r>
-      <w:proofErr w:type="spellEnd"/>
-      <w:r>
-        <w:rPr>
-          <w:color w:val="000000"/>
-          <w:sz w:val="20"/>
-          <w:szCs w:val="20"/>
-        </w:rPr>
-        <w:t xml:space="preserve"> Augusto Pires Miranda.</w:t>
+        <w:t>Coorientador: Prof. Msc. Myagyh Augusto Pires Miranda.</w:t>
       </w:r>
     </w:p>
     <w:p>
@@ -931,7 +847,6 @@
           <w:szCs w:val="24"/>
         </w:rPr>
       </w:pPr>
-      <w:proofErr w:type="spellStart"/>
       <w:r>
         <w:rPr>
           <w:b/>
@@ -940,7 +855,6 @@
         </w:rPr>
         <w:t>Reportaí</w:t>
       </w:r>
-      <w:proofErr w:type="spellEnd"/>
       <w:r>
         <w:rPr>
           <w:b/>
@@ -987,21 +901,7 @@
         <w:rPr>
           <w:szCs w:val="24"/>
         </w:rPr>
-        <w:t xml:space="preserve">Este Trabalho Conclusão de Curso foi julgado adequado para obtenção do Título de Tecnólogo em Análise e Desenvolvimento de Sistemas e aprovado em sua forma final pelo Curso Análise </w:t>
-      </w:r>
-      <w:proofErr w:type="gramStart"/>
-      <w:r>
-        <w:rPr>
-          <w:szCs w:val="24"/>
-        </w:rPr>
-        <w:t>e  Desenvolvimento</w:t>
-      </w:r>
-      <w:proofErr w:type="gramEnd"/>
-      <w:r>
-        <w:rPr>
-          <w:szCs w:val="24"/>
-        </w:rPr>
-        <w:t xml:space="preserve"> de Sistemas</w:t>
+        <w:t>Este Trabalho Conclusão de Curso foi julgado adequado para obtenção do Título de Tecnólogo em Análise e Desenvolvimento de Sistemas e aprovado em sua forma final pelo Curso Análise e  Desenvolvimento de Sistemas</w:t>
       </w:r>
     </w:p>
     <w:p>
@@ -1088,21 +988,7 @@
         <w:rPr>
           <w:szCs w:val="24"/>
         </w:rPr>
-        <w:t xml:space="preserve">Prof. </w:t>
-      </w:r>
-      <w:proofErr w:type="spellStart"/>
-      <w:r>
-        <w:rPr>
-          <w:szCs w:val="24"/>
-        </w:rPr>
-        <w:t>xxx</w:t>
-      </w:r>
-      <w:proofErr w:type="spellEnd"/>
-      <w:r>
-        <w:rPr>
-          <w:szCs w:val="24"/>
-        </w:rPr>
-        <w:t>, Dr.</w:t>
+        <w:t>Prof. xxx, Dr.</w:t>
       </w:r>
     </w:p>
     <w:p>
@@ -1208,21 +1094,7 @@
         <w:rPr>
           <w:szCs w:val="24"/>
         </w:rPr>
-        <w:t xml:space="preserve">Prof.(a) </w:t>
-      </w:r>
-      <w:proofErr w:type="spellStart"/>
-      <w:r>
-        <w:rPr>
-          <w:szCs w:val="24"/>
-        </w:rPr>
-        <w:t>xxxx</w:t>
-      </w:r>
-      <w:proofErr w:type="spellEnd"/>
-      <w:r>
-        <w:rPr>
-          <w:szCs w:val="24"/>
-        </w:rPr>
-        <w:t xml:space="preserve">, Dr.(a) </w:t>
+        <w:t xml:space="preserve">Prof.(a) xxxx, Dr.(a) </w:t>
       </w:r>
     </w:p>
     <w:p>
@@ -1272,16 +1144,8 @@
         <w:rPr>
           <w:szCs w:val="24"/>
         </w:rPr>
-        <w:t xml:space="preserve">Instituição </w:t>
-      </w:r>
-      <w:proofErr w:type="spellStart"/>
-      <w:r>
-        <w:rPr>
-          <w:szCs w:val="24"/>
-        </w:rPr>
-        <w:t>xxxx</w:t>
-      </w:r>
-      <w:proofErr w:type="spellEnd"/>
+        <w:t>Instituição xxxx</w:t>
+      </w:r>
     </w:p>
     <w:p>
       <w:pPr>
@@ -1342,21 +1206,7 @@
         <w:rPr>
           <w:szCs w:val="24"/>
         </w:rPr>
-        <w:t xml:space="preserve">Prof.(a) </w:t>
-      </w:r>
-      <w:proofErr w:type="spellStart"/>
-      <w:r>
-        <w:rPr>
-          <w:szCs w:val="24"/>
-        </w:rPr>
-        <w:t>xxxx</w:t>
-      </w:r>
-      <w:proofErr w:type="spellEnd"/>
-      <w:r>
-        <w:rPr>
-          <w:szCs w:val="24"/>
-        </w:rPr>
-        <w:t xml:space="preserve">, Dr.(a) </w:t>
+        <w:t xml:space="preserve">Prof.(a) xxxx, Dr.(a) </w:t>
       </w:r>
     </w:p>
     <w:p>
@@ -1400,16 +1250,8 @@
         <w:rPr>
           <w:szCs w:val="24"/>
         </w:rPr>
-        <w:t xml:space="preserve">Instituição </w:t>
-      </w:r>
-      <w:proofErr w:type="spellStart"/>
-      <w:r>
-        <w:rPr>
-          <w:szCs w:val="24"/>
-        </w:rPr>
-        <w:t>xxxx</w:t>
-      </w:r>
-      <w:proofErr w:type="spellEnd"/>
+        <w:t>Instituição xxxx</w:t>
+      </w:r>
     </w:p>
     <w:p>
       <w:pPr>
@@ -1470,21 +1312,7 @@
         <w:rPr>
           <w:szCs w:val="24"/>
         </w:rPr>
-        <w:t xml:space="preserve">Prof.(a) </w:t>
-      </w:r>
-      <w:proofErr w:type="spellStart"/>
-      <w:r>
-        <w:rPr>
-          <w:szCs w:val="24"/>
-        </w:rPr>
-        <w:t>xxxx</w:t>
-      </w:r>
-      <w:proofErr w:type="spellEnd"/>
-      <w:r>
-        <w:rPr>
-          <w:szCs w:val="24"/>
-        </w:rPr>
-        <w:t xml:space="preserve">, Dr.(a) </w:t>
+        <w:t xml:space="preserve">Prof.(a) xxxx, Dr.(a) </w:t>
       </w:r>
     </w:p>
     <w:p>
@@ -1528,16 +1356,8 @@
         <w:rPr>
           <w:szCs w:val="24"/>
         </w:rPr>
-        <w:t xml:space="preserve">Instituição </w:t>
-      </w:r>
-      <w:proofErr w:type="spellStart"/>
-      <w:r>
-        <w:rPr>
-          <w:szCs w:val="24"/>
-        </w:rPr>
-        <w:t>xxxx</w:t>
-      </w:r>
-      <w:proofErr w:type="spellEnd"/>
+        <w:t>Instituição xxxx</w:t>
+      </w:r>
     </w:p>
     <w:p>
       <w:pPr>
@@ -3205,7 +3025,6 @@
           <w:szCs w:val="24"/>
         </w:rPr>
       </w:pPr>
-      <w:proofErr w:type="gramStart"/>
       <w:r>
         <w:rPr>
           <w:szCs w:val="24"/>
@@ -3216,14 +3035,7 @@
         <w:rPr>
           <w:szCs w:val="24"/>
         </w:rPr>
-        <w:t>Instituto</w:t>
-      </w:r>
-      <w:proofErr w:type="gramEnd"/>
-      <w:r>
-        <w:rPr>
-          <w:szCs w:val="24"/>
-        </w:rPr>
-        <w:t xml:space="preserve"> Brasileiro de Geografia e Estatística</w:t>
+        <w:t>Instituto Brasileiro de Geografia e Estatística</w:t>
       </w:r>
     </w:p>
     <w:p>
@@ -3285,7 +3097,7 @@
           <w:noProof/>
         </w:rPr>
         <w:drawing>
-          <wp:anchor distT="0" distB="0" distL="0" distR="0" simplePos="0" relativeHeight="251657216" behindDoc="0" locked="0" layoutInCell="1" allowOverlap="0" wp14:anchorId="73651F8C" wp14:editId="2D67B8F8">
+          <wp:anchor distT="0" distB="0" distL="0" distR="0" simplePos="0" relativeHeight="251657216" behindDoc="0" locked="0" layoutInCell="1" allowOverlap="0" wp14:anchorId="73651F8C" wp14:editId="68C8F813">
             <wp:simplePos x="0" y="0"/>
             <wp:positionH relativeFrom="column">
               <wp:posOffset>56515</wp:posOffset>
@@ -3386,7 +3198,7 @@
           <w:noProof/>
         </w:rPr>
         <w:drawing>
-          <wp:anchor distT="0" distB="0" distL="0" distR="0" simplePos="0" relativeHeight="251658240" behindDoc="0" locked="0" layoutInCell="1" allowOverlap="0" wp14:anchorId="65BDD473" wp14:editId="17D6FAFF">
+          <wp:anchor distT="0" distB="0" distL="0" distR="0" simplePos="0" relativeHeight="251658240" behindDoc="0" locked="0" layoutInCell="1" allowOverlap="0" wp14:anchorId="65BDD473" wp14:editId="7CFBF3E8">
             <wp:simplePos x="0" y="0"/>
             <wp:positionH relativeFrom="column">
               <wp:posOffset>50165</wp:posOffset>
@@ -4981,7 +4793,6 @@
         </w:rPr>
         <w:t xml:space="preserve">, guias, </w:t>
       </w:r>
-      <w:proofErr w:type="spellStart"/>
       <w:r>
         <w:rPr>
           <w:rStyle w:val="CitaoChar"/>
@@ -4989,7 +4800,6 @@
         </w:rPr>
         <w:t>templates</w:t>
       </w:r>
-      <w:proofErr w:type="spellEnd"/>
       <w:r>
         <w:rPr>
           <w:rStyle w:val="CitaoChar"/>
@@ -5453,15 +5263,7 @@
     </w:p>
     <w:p>
       <w:r>
-        <w:t xml:space="preserve">Assim como que para manipular um banco de dados é </w:t>
-      </w:r>
-      <w:proofErr w:type="gramStart"/>
-      <w:r>
-        <w:t>necessário uma linguagem</w:t>
-      </w:r>
-      <w:proofErr w:type="gramEnd"/>
-      <w:r>
-        <w:t>, para desenvolver um sistema é necessário uma linguagem de programação. Uma linguagem de programação é um conjunto de recursos que podem ser compostos para construir um programa de computador. (MELO, 2003). Existem várias linguagens de programação, cada uma com suas características e aplicações. Neste projeto, foram utilizadas principalmente Java e Javascript.</w:t>
+        <w:t>Assim como que para manipular um banco de dados é necessário uma linguagem, para desenvolver um sistema é necessário uma linguagem de programação. Uma linguagem de programação é um conjunto de recursos que podem ser compostos para construir um programa de computador. (MELO, 2003). Existem várias linguagens de programação, cada uma com suas características e aplicações. Neste projeto, foram utilizadas principalmente Java e Javascript.</w:t>
       </w:r>
     </w:p>
     <w:p/>
@@ -5475,472 +5277,493 @@
     </w:p>
     <w:p>
       <w:r>
-        <w:t xml:space="preserve">Java é uma linguagem de programação de propósito geral, orientada a objetos pode ser executada independentemente da plataforma operacional em uso, pois se baseia no conceito de máquina virtual (MANZANO, 2014). Além de ser uma linguagem poderosa, Java é uma linguagem simples, de fácil aprendizado ou migração, pois é uma linguagem de alto nível, ou seja, é mais próxima da linguagem humana do que da linguagem de máquina (INDRUSIAK, 1996). No contexto do sistema, Java foi utilizado para a criação do </w:t>
-      </w:r>
-      <w:proofErr w:type="spellStart"/>
-      <w:r>
-        <w:t>back-end</w:t>
-      </w:r>
-      <w:proofErr w:type="spellEnd"/>
-      <w:r>
-        <w:t xml:space="preserve">, que é a parte do </w:t>
+        <w:t xml:space="preserve">Java é uma linguagem de programação de propósito geral, orientada a objetos pode ser executada independentemente da plataforma operacional em uso, pois se baseia no conceito de máquina virtual (MANZANO, 2014). Além de ser uma linguagem poderosa, Java é uma linguagem simples, de fácil aprendizado ou migração, pois é uma linguagem de alto </w:t>
       </w:r>
       <w:r>
         <w:lastRenderedPageBreak/>
-        <w:t xml:space="preserve">sistema que não é visível ao usuário, mas que é responsável por processar as informações e retornar as respostas para o </w:t>
-      </w:r>
-      <w:proofErr w:type="spellStart"/>
-      <w:r>
-        <w:t>front-end</w:t>
-      </w:r>
-      <w:proofErr w:type="spellEnd"/>
+        <w:t>nível, ou seja, é mais próxima da linguagem humana do que da linguagem de máquina (INDRUSIAK, 1996). No contexto do sistema, Java foi utilizado para a criação do back-end, que é a parte do sistema que não é visível ao usuário, mas que é responsável por processar as informações e retornar as respostas para o front-end.</w:t>
+      </w:r>
+    </w:p>
+    <w:p/>
+    <w:p>
+      <w:pPr>
+        <w:pStyle w:val="Ttulo4"/>
+      </w:pPr>
+      <w:r>
+        <w:t xml:space="preserve"> Javascript</w:t>
+      </w:r>
+    </w:p>
+    <w:p>
+      <w:r>
+        <w:t>Embora o nome seja parecido, Javascript não tem relação com Java. Javascript é uma linguagem de programação usada em parceria com o HTML, com a finalidade de criar páginas web interativas (OLIVIERO, 2001). O HTML, como será descrito em seguida, é uma linguagem de marcação que define a estrutura de uma página web, enquanto o Javascript é uma linguagem de programação que define o comportamento da página. No contexto do sistema, Javascript foi utilizado para a criação do front-end, que é a parte do sistema que é visível ao usuário, e que permite a interação com o sistema.</w:t>
+      </w:r>
+    </w:p>
+    <w:p/>
+    <w:p>
+      <w:pPr>
+        <w:pStyle w:val="Ttulo3"/>
+      </w:pPr>
+      <w:r>
+        <w:t xml:space="preserve"> </w:t>
+      </w:r>
+      <w:r>
+        <w:t>Linguagens de marcação</w:t>
+      </w:r>
+    </w:p>
+    <w:p/>
+    <w:p>
+      <w:pPr>
+        <w:pStyle w:val="Ttulo4"/>
+      </w:pPr>
+      <w:r>
+        <w:t xml:space="preserve"> </w:t>
+      </w:r>
+      <w:r>
+        <w:t>HTML</w:t>
+      </w:r>
+    </w:p>
+    <w:p>
+      <w:r>
+        <w:t>A</w:t>
+      </w:r>
+      <w:r>
+        <w:t xml:space="preserve"> Web é baseada em três pilares: um esquema de localização de fontes, um protocolo para acessar estas fontes e uma linguagem de marcação para descrever o conteúdo: o HTML (SILVA JÚNIOR, 2013). HTML, sigla para Hypertext Markup Language, é uma linguagem utilizada para a publicação de conteúdos variados na Web, como texto, imagem, vídeo e áudio. Baseado no conceito de hipertexto, o HTML organiza elementos — ou nós — conectados entre si. Esses elementos podem incluir palavras, imagens, vídeos, áudio e documentos, formando uma vasta rede de informações interligadas. (SILVA JÚNIOR, 2013)</w:t>
+      </w:r>
+    </w:p>
+    <w:p/>
+    <w:p>
+      <w:pPr>
+        <w:pStyle w:val="Ttulo4"/>
+      </w:pPr>
+      <w:r>
+        <w:t xml:space="preserve"> </w:t>
+      </w:r>
+      <w:r>
+        <w:t>CSS</w:t>
+      </w:r>
+    </w:p>
+    <w:p>
+      <w:r>
+        <w:t>Enquanto o HTML é responsável pela estrutura de uma página web, o CSS é responsável pela aparência. CSS, sigla para Cascading Style Sheets, é um mecanismo simples para adicionar estilos, como fontes, cores e espaçamentos, a um documento web (SILVA, 2008). O CSS permite que o desenvolvedor controle a aparência de um site, separando o conteúdo da apresentação. Isso significa que o desenvolvedor pode alterar a aparência de um site sem alterar o conteúdo, tornando a manutenção mais fácil e rápida.</w:t>
+      </w:r>
+    </w:p>
+    <w:p>
+      <w:pPr>
+        <w:pStyle w:val="Ttulo3"/>
+      </w:pPr>
+      <w:r>
+        <w:lastRenderedPageBreak/>
+        <w:t xml:space="preserve"> Frameworks</w:t>
+      </w:r>
+    </w:p>
+    <w:p>
+      <w:r>
+        <w:t xml:space="preserve">As linguagens de programação </w:t>
+      </w:r>
+      <w:r>
+        <w:t>são o pilar de qualquer sistema de computação</w:t>
+      </w:r>
+      <w:r>
+        <w:t>, porém</w:t>
+      </w:r>
+      <w:r>
+        <w:t xml:space="preserve">, </w:t>
+      </w:r>
+      <w:r>
+        <w:t xml:space="preserve">um sistema </w:t>
+      </w:r>
+      <w:r>
+        <w:t xml:space="preserve">é muito maior do que uma simples construção, </w:t>
+      </w:r>
+      <w:r>
+        <w:t>seguindo esta analogia</w:t>
+      </w:r>
+      <w:r>
+        <w:t xml:space="preserve">, até um sistema simples seria equivalente a uma cidade inteira de pilares. </w:t>
+      </w:r>
+      <w:r>
+        <w:t>Para isso existe</w:t>
+      </w:r>
+      <w:r>
+        <w:t xml:space="preserve">m os frameworks, que são </w:t>
+      </w:r>
+      <w:r>
+        <w:t>construções básicas genéricas e prontas que facilitam o desenvolvimento.</w:t>
+      </w:r>
+      <w:r>
+        <w:t xml:space="preserve"> </w:t>
+      </w:r>
+      <w:r>
+        <w:t>Um framework web é uma estrutura arquitetônica que fornece um ambiente de execução para aplicações web ou suas interfaces de usuário</w:t>
+      </w:r>
+      <w:r>
+        <w:t xml:space="preserve"> </w:t>
+      </w:r>
+      <w:r>
+        <w:t>(VOSLOO,</w:t>
+      </w:r>
+      <w:r>
+        <w:t xml:space="preserve"> 2005</w:t>
+      </w:r>
+      <w:r>
+        <w:t>).</w:t>
+      </w:r>
+    </w:p>
+    <w:p/>
+    <w:p>
+      <w:pPr>
+        <w:pStyle w:val="Ttulo4"/>
+      </w:pPr>
+      <w:r>
+        <w:t xml:space="preserve"> Java Spring</w:t>
+      </w:r>
+    </w:p>
+    <w:p>
+      <w:r>
+        <w:t xml:space="preserve">Java Spring </w:t>
+      </w:r>
+      <w:r>
+        <w:t>é um framework que oferece suporte ao padrão MVC, fornece funcionalidades para RESTful Web Services, e inclui uma conexão de banco de dados no pacote. Ele também suporta injeção de dependência, o que facilita a configuração de dependências na aplicação</w:t>
+      </w:r>
+      <w:r>
+        <w:t xml:space="preserve"> (</w:t>
+      </w:r>
+      <w:r>
+        <w:t>HATMA</w:t>
+      </w:r>
+      <w:r>
+        <w:t>, 2017). Por esses motivos, Java Spring foi escolhido para construir o back-end do sistema.</w:t>
+      </w:r>
+    </w:p>
+    <w:p/>
+    <w:p>
+      <w:pPr>
+        <w:pStyle w:val="Ttulo4"/>
+      </w:pPr>
+      <w:r>
+        <w:t xml:space="preserve"> ReactJS</w:t>
+      </w:r>
+    </w:p>
+    <w:p>
+      <w:r>
+        <w:t>O ReactJS</w:t>
+      </w:r>
+      <w:r>
+        <w:t>, ou só React,</w:t>
+      </w:r>
+      <w:r>
+        <w:t xml:space="preserve"> é uma biblioteca de código aberto que é utilizada para construir interfaces de usuário</w:t>
+      </w:r>
       <w:r>
         <w:t>.</w:t>
       </w:r>
+      <w:r>
+        <w:t xml:space="preserve"> O Reac</w:t>
+      </w:r>
+      <w:r>
+        <w:t>t</w:t>
+      </w:r>
+      <w:r>
+        <w:t xml:space="preserve"> permite que programadores criem grandes aplicações web que podem mudar ao longo do tempo sem precisar recarregar a página</w:t>
+      </w:r>
+      <w:r>
+        <w:t xml:space="preserve">, resultando em uma navegação mais fluída para o usuário. </w:t>
+      </w:r>
+      <w:r>
+        <w:t>(</w:t>
+      </w:r>
+      <w:r>
+        <w:t>RAWAT</w:t>
+      </w:r>
+      <w:r>
+        <w:t xml:space="preserve">, </w:t>
+      </w:r>
+      <w:r>
+        <w:t>2020</w:t>
+      </w:r>
+      <w:r>
+        <w:t>)</w:t>
+      </w:r>
     </w:p>
     <w:p/>
     <w:p>
       <w:pPr>
+        <w:pStyle w:val="Ttulo3"/>
+      </w:pPr>
+      <w:r>
+        <w:t xml:space="preserve"> API</w:t>
+      </w:r>
+    </w:p>
+    <w:p>
+      <w:r>
+        <w:t>A comunicação entre o front-end da aplicação e o back-end, assim como a comunicação com sistemas externos</w:t>
+      </w:r>
+      <w:r>
+        <w:t>, ocorre via API.</w:t>
+      </w:r>
+      <w:r>
+        <w:t xml:space="preserve"> </w:t>
+      </w:r>
+      <w:r>
+        <w:t>API significa interface de programação de aplicações. Uma API ajuda a expor um serviço de negócio ou um ativo empresarial para os desenvolvedores que estão criando uma aplicação</w:t>
+      </w:r>
+      <w:r>
+        <w:t xml:space="preserve"> (</w:t>
+      </w:r>
+      <w:r>
+        <w:t>DE</w:t>
+      </w:r>
+      <w:r>
+        <w:t xml:space="preserve">, 2017). </w:t>
+      </w:r>
+      <w:r>
+        <w:t>Uma interface pode ser entendida como um acordo de serviço entre duas aplicações, estabelecendo as regras para a comunicação entre elas por meio de solicitações e respostas. A documentação das respectivas APIs fornece detalhes sobre como os desenvolvedores devem organizar essas solicitações e respostas.</w:t>
+      </w:r>
+      <w:r>
+        <w:t xml:space="preserve"> (AMAZON, 2024).</w:t>
+      </w:r>
+    </w:p>
+    <w:p/>
+    <w:p>
+      <w:pPr>
         <w:pStyle w:val="Ttulo4"/>
       </w:pPr>
       <w:r>
-        <w:t xml:space="preserve"> Javascript</w:t>
-      </w:r>
-    </w:p>
-    <w:p>
-      <w:r>
-        <w:t xml:space="preserve">Embora o nome seja parecido, Javascript não tem relação com Java. Javascript é uma linguagem de programação usada em parceria com o HTML, com a finalidade de criar páginas web interativas (OLIVIERO, 2001). O HTML, como será descrito em seguida, é uma linguagem de marcação que define a estrutura de uma página web, enquanto o Javascript é uma linguagem de programação que define o comportamento da página. No contexto do sistema, Javascript foi utilizado para a criação do </w:t>
-      </w:r>
-      <w:proofErr w:type="spellStart"/>
-      <w:r>
-        <w:t>front-end</w:t>
-      </w:r>
-      <w:proofErr w:type="spellEnd"/>
-      <w:r>
-        <w:t>, que é a parte do sistema que é visível ao usuário, e que permite a interação com o sistema.</w:t>
+        <w:lastRenderedPageBreak/>
+        <w:t xml:space="preserve"> </w:t>
+      </w:r>
+      <w:r>
+        <w:t>REST</w:t>
+      </w:r>
+    </w:p>
+    <w:p>
+      <w:r>
+        <w:t xml:space="preserve">As APIs, tanto internas quanto externas, utilizam o </w:t>
+      </w:r>
+      <w:r>
+        <w:t>padrão</w:t>
+      </w:r>
+      <w:r>
+        <w:t xml:space="preserve"> REST. </w:t>
+      </w:r>
+      <w:r>
+        <w:t>REST é a sigla em inglês para "Representational State Transfer", que em português significa "tansferência de estado representacional". Essa arquitetura foi criada pelo cientista da computação norte-americano Roy Fielding</w:t>
+      </w:r>
+      <w:r>
+        <w:t xml:space="preserve"> (RED HAT, 2024). </w:t>
+      </w:r>
+      <w:r>
+        <w:t>As APIs REST seguem princípios como interface uniforme, garantindo consistência nas solicitações, e desacoplamento cliente-servidor, permitindo que cada parte opere de forma independente. Elas são sem estado, exigindo que cada solicitação seja completa em si mesma, e suportam cacheabilidade para melhorar a performance. Além disso, a arquitetura em camadas permite que as interações passem por intermediários sem que isso seja perceptível</w:t>
+      </w:r>
+      <w:r>
+        <w:t xml:space="preserve"> (IMB, 2024).</w:t>
       </w:r>
     </w:p>
     <w:p/>
     <w:p>
       <w:pPr>
+        <w:pStyle w:val="Ttulo4"/>
+      </w:pPr>
+      <w:r>
+        <w:t xml:space="preserve"> </w:t>
+      </w:r>
+      <w:r>
+        <w:t>HTTP</w:t>
+      </w:r>
+    </w:p>
+    <w:p>
+      <w:r>
+        <w:t xml:space="preserve">As APIs então são pontes de contato entre sistemas e </w:t>
+      </w:r>
+      <w:r>
+        <w:t>as que foram utilizadas no projeto foram construídas seguindo os padrões REST</w:t>
+      </w:r>
+      <w:r>
+        <w:t xml:space="preserve">. </w:t>
+      </w:r>
+      <w:r>
+        <w:t>Para que a comunicação entre sistemas ocorra, é necessário um protocolo de comunicação.</w:t>
+      </w:r>
+      <w:r>
+        <w:t xml:space="preserve"> </w:t>
+      </w:r>
+      <w:r>
+        <w:t>HTTP é um protocolo que permite a obtenção de recursos, como documentos HTML</w:t>
+      </w:r>
+      <w:r>
+        <w:t>, por exemplo</w:t>
+      </w:r>
+      <w:r>
+        <w:t>. Ele serve como a base para qualquer troca de dados na Web e funciona como um protocolo cliente-servidor, no qual as solicitações são iniciadas pelo destinatário, geralmente o navegador web</w:t>
+      </w:r>
+      <w:r>
+        <w:t xml:space="preserve"> (</w:t>
+      </w:r>
+      <w:r>
+        <w:t>SUBIKSHA</w:t>
+      </w:r>
+      <w:r>
+        <w:t>, 20</w:t>
+      </w:r>
+      <w:r>
+        <w:t xml:space="preserve">19). </w:t>
+      </w:r>
+    </w:p>
+    <w:p/>
+    <w:p>
+      <w:pPr>
+        <w:pStyle w:val="Ttulo4"/>
+      </w:pPr>
+      <w:r>
+        <w:t xml:space="preserve"> </w:t>
+      </w:r>
+      <w:r>
+        <w:t>OpenStreetMap</w:t>
+      </w:r>
+    </w:p>
+    <w:p>
+      <w:r>
+        <w:t xml:space="preserve">O core do sistema consiste na utilização de mapas interativos. Estes mapas são fornecidos pela API do OpenStreetMap. </w:t>
+      </w:r>
+      <w:r>
+        <w:t>O OpenStreetMap é desenvolvido por uma comunidade voluntária de mapeadores que contribuem e mantêm atualizados os dados sobre estradas, trilhos, cafés, estações ferroviárias e muito mais por todo o mundo</w:t>
+      </w:r>
+      <w:r>
+        <w:t xml:space="preserve"> (OSM, 2024). </w:t>
+      </w:r>
+      <w:r>
+        <w:t>OpenStreetMap revolucionou a cartografia ao permitir que usuários comuns contribuam para a criação de mapas, algo antes reservado a especialistas com equipamentos avançados</w:t>
+      </w:r>
+      <w:r>
+        <w:t xml:space="preserve"> </w:t>
+      </w:r>
+      <w:r>
+        <w:t>(</w:t>
+      </w:r>
+      <w:r>
+        <w:t>HAKLAY</w:t>
+      </w:r>
+      <w:r>
+        <w:t>, 2008).</w:t>
+      </w:r>
+    </w:p>
+    <w:p/>
+    <w:p>
+      <w:pPr>
+        <w:pStyle w:val="Ttulo4"/>
+      </w:pPr>
+      <w:r>
+        <w:t xml:space="preserve"> MapTiler</w:t>
+      </w:r>
+    </w:p>
+    <w:p>
+      <w:r>
+        <w:t xml:space="preserve">Para manipular a API do OpenStreetMap, foi utilizada a API do MapTiler, que permitiu a estilização e um maior controle sobre os mapas </w:t>
+      </w:r>
+      <w:r>
+        <w:t xml:space="preserve">apresentados. </w:t>
+      </w:r>
+      <w:r>
+        <w:t xml:space="preserve">O MapTiler é uma plataforma que permite criar, personalizar e hospedar mapas utilizando dados do OpenStreetMap e outras fontes. Ele oferece uma API de mapas para integrar mapas vetoriais </w:t>
+      </w:r>
+      <w:r>
+        <w:lastRenderedPageBreak/>
+        <w:t>ou rasterizados em sites ou aplicativos, personalizando cores, fontes e até mesmo carregando tiles próprios</w:t>
+      </w:r>
+      <w:r>
+        <w:t xml:space="preserve"> </w:t>
+      </w:r>
+      <w:r>
+        <w:t>(</w:t>
+      </w:r>
+      <w:r>
+        <w:t>MAPTILER</w:t>
+      </w:r>
+      <w:r>
+        <w:t>, 2024)</w:t>
+      </w:r>
+      <w:r>
+        <w:t>.</w:t>
+      </w:r>
+    </w:p>
+    <w:p/>
+    <w:p>
+      <w:pPr>
         <w:pStyle w:val="Ttulo3"/>
       </w:pPr>
       <w:r>
+        <w:t xml:space="preserve"> Bibliotecas</w:t>
+      </w:r>
+    </w:p>
+    <w:p>
+      <w:r>
+        <w:t xml:space="preserve">Assim como os frameworks, as bibliotecas também são estruturas de código prontas que podem ser utilizadas no sistema para trazer agilidade e robustez. Enquanto um framework geralmente engloba as estruturas fundamentais do sistema, como gerenciamento de servidor e de recursos visuais, as bibliotecas são apenas funções prontas que podem ser usadas quando necessárias. </w:t>
+      </w:r>
+    </w:p>
+    <w:p/>
+    <w:p>
+      <w:pPr>
+        <w:pStyle w:val="Ttulo4"/>
+      </w:pPr>
+      <w:r>
+        <w:t xml:space="preserve"> Leaflet</w:t>
+      </w:r>
+    </w:p>
+    <w:p>
+      <w:r>
+        <w:t xml:space="preserve">O Leaflet é uma biblioteca JavaScript </w:t>
+      </w:r>
+      <w:r>
+        <w:t xml:space="preserve">utilizada para </w:t>
+      </w:r>
+      <w:r>
+        <w:t>gerenciar mapas interativos e flexíveis para web</w:t>
+      </w:r>
+      <w:r>
+        <w:t xml:space="preserve"> e </w:t>
+      </w:r>
+      <w:r>
+        <w:t>é frequentemente usada em conjunto com MapTiler Cloud e OpenStreetMap.</w:t>
+      </w:r>
+      <w:r>
         <w:t xml:space="preserve"> </w:t>
       </w:r>
       <w:r>
-        <w:t>Linguagens de marcação</w:t>
+        <w:t>Lançada em 2023, ela permite que desenvolvedores integrem interações como zoom, marcações e camadas de informações</w:t>
+      </w:r>
+      <w:r>
+        <w:t xml:space="preserve"> nos mapas.</w:t>
+      </w:r>
+      <w:r>
+        <w:t xml:space="preserve"> Além de ser de código aberto, o Leaflet suporta uma variedade de plugins que expandem suas funcionalidades, como a visualização de dados geoespaciais e rotas</w:t>
+      </w:r>
+      <w:r>
+        <w:t xml:space="preserve"> (</w:t>
+      </w:r>
+      <w:r>
+        <w:rPr>
+          <w:szCs w:val="24"/>
+        </w:rPr>
+        <w:t>LEAFLET</w:t>
+      </w:r>
+      <w:r>
+        <w:rPr>
+          <w:szCs w:val="24"/>
+        </w:rPr>
+        <w:t>, 2014).</w:t>
       </w:r>
     </w:p>
     <w:p/>
-    <w:p>
-      <w:pPr>
-        <w:pStyle w:val="Ttulo4"/>
-      </w:pPr>
-      <w:r>
-        <w:t xml:space="preserve"> </w:t>
-      </w:r>
-      <w:r>
-        <w:t>HTML</w:t>
-      </w:r>
-    </w:p>
-    <w:p>
-      <w:r>
-        <w:t>A</w:t>
-      </w:r>
-      <w:r>
-        <w:t xml:space="preserve"> Web é baseada em três pilares: um esquema de localização de fontes, um protocolo para acessar estas fontes e uma linguagem de marcação para descrever o conteúdo: o HTML (SILVA JÚNIOR, 2013). HTML, sigla para Hypertext Markup </w:t>
-      </w:r>
-      <w:proofErr w:type="spellStart"/>
-      <w:r>
-        <w:t>Language</w:t>
-      </w:r>
-      <w:proofErr w:type="spellEnd"/>
-      <w:r>
-        <w:t>, é uma linguagem utilizada para a publicação de conteúdos variados na Web, como texto, imagem, vídeo e áudio. Baseado no conceito de hipertexto, o HTML organiza elementos — ou nós — conectados entre si. Esses elementos podem incluir palavras, imagens, vídeos, áudio e documentos, formando uma vasta rede de informações interligadas. (SILVA JÚNIOR, 2013)</w:t>
-      </w:r>
-    </w:p>
     <w:p/>
     <w:p>
       <w:pPr>
-        <w:pStyle w:val="Ttulo4"/>
-      </w:pPr>
-      <w:r>
-        <w:t xml:space="preserve"> </w:t>
-      </w:r>
-      <w:r>
-        <w:t>CSS</w:t>
-      </w:r>
-    </w:p>
-    <w:p>
-      <w:r>
-        <w:t xml:space="preserve">Enquanto o HTML é responsável pela estrutura de uma página web, o CSS é responsável pela aparência. CSS, sigla para </w:t>
-      </w:r>
-      <w:proofErr w:type="spellStart"/>
-      <w:r>
-        <w:t>Cascading</w:t>
-      </w:r>
-      <w:proofErr w:type="spellEnd"/>
-      <w:r>
-        <w:t xml:space="preserve"> </w:t>
-      </w:r>
-      <w:proofErr w:type="spellStart"/>
-      <w:r>
-        <w:t>Style</w:t>
-      </w:r>
-      <w:proofErr w:type="spellEnd"/>
-      <w:r>
-        <w:t xml:space="preserve"> </w:t>
-      </w:r>
-      <w:proofErr w:type="spellStart"/>
-      <w:r>
-        <w:t>Sheets</w:t>
-      </w:r>
-      <w:proofErr w:type="spellEnd"/>
-      <w:r>
-        <w:t>, é um mecanismo simples para adicionar estilos, como fontes, cores e espaçamentos, a um documento web (SILVA, 2008). O CSS permite que o desenvolvedor controle a aparência de um site, separando o conteúdo da apresentação. Isso significa que o desenvolvedor pode alterar a aparência de um site sem alterar o conteúdo, tornando a manutenção mais fácil e rápida.</w:t>
-      </w:r>
-    </w:p>
-    <w:p>
-      <w:pPr>
-        <w:pStyle w:val="Ttulo3"/>
-      </w:pPr>
-      <w:r>
-        <w:t xml:space="preserve"> Frameworks</w:t>
-      </w:r>
-    </w:p>
-    <w:p>
-      <w:r>
-        <w:t xml:space="preserve">As linguagens de programação </w:t>
-      </w:r>
-      <w:r>
-        <w:t>são o pilar de qualquer sistema de computação</w:t>
-      </w:r>
-      <w:r>
-        <w:t>, porém</w:t>
-      </w:r>
-      <w:r>
-        <w:t xml:space="preserve">, </w:t>
-      </w:r>
-      <w:r>
-        <w:t xml:space="preserve">um sistema </w:t>
-      </w:r>
-      <w:r>
-        <w:t xml:space="preserve">é muito maior do que uma simples construção, </w:t>
-      </w:r>
-      <w:r>
-        <w:t>seguindo esta analogia</w:t>
-      </w:r>
-      <w:r>
-        <w:t xml:space="preserve">, até um </w:t>
-      </w:r>
-      <w:r>
-        <w:lastRenderedPageBreak/>
-        <w:t xml:space="preserve">sistema simples seria equivalente a uma cidade inteira de pilares. </w:t>
-      </w:r>
-      <w:r>
-        <w:t>Para isso existe</w:t>
-      </w:r>
-      <w:r>
-        <w:t xml:space="preserve">m os frameworks, que são </w:t>
-      </w:r>
-      <w:r>
-        <w:t>construções básicas genéricas e prontas que facilitam o desenvolvimento.</w:t>
-      </w:r>
-      <w:r>
-        <w:t xml:space="preserve"> </w:t>
-      </w:r>
-      <w:r>
-        <w:t>Um framework web é uma estrutura arquitetônica que fornece um ambiente de execução para aplicações web ou suas interfaces de usuário</w:t>
-      </w:r>
-      <w:r>
-        <w:t xml:space="preserve"> </w:t>
-      </w:r>
-      <w:r>
-        <w:t>(VOSLOO,</w:t>
-      </w:r>
-      <w:r>
-        <w:t xml:space="preserve"> 2005</w:t>
-      </w:r>
-      <w:r>
-        <w:t>).</w:t>
-      </w:r>
-    </w:p>
-    <w:p/>
-    <w:p>
-      <w:pPr>
-        <w:pStyle w:val="Ttulo4"/>
-      </w:pPr>
-      <w:r>
-        <w:t xml:space="preserve"> Java Spring</w:t>
-      </w:r>
-    </w:p>
-    <w:p>
-      <w:r>
-        <w:t xml:space="preserve">Java Spring </w:t>
-      </w:r>
-      <w:r>
-        <w:t xml:space="preserve">é um framework </w:t>
-      </w:r>
-      <w:proofErr w:type="spellStart"/>
-      <w:r>
-        <w:t>que oferece</w:t>
-      </w:r>
-      <w:proofErr w:type="spellEnd"/>
-      <w:r>
-        <w:t xml:space="preserve"> suporte ao padrão MVC, fornece funcionalidades para </w:t>
-      </w:r>
-      <w:proofErr w:type="spellStart"/>
-      <w:r>
-        <w:t>RESTful</w:t>
-      </w:r>
-      <w:proofErr w:type="spellEnd"/>
-      <w:r>
-        <w:t xml:space="preserve"> Web Services, e inclui uma conexão de banco de dados no pacote. Ele também suporta injeção de dependência, o que facilita a configuração de dependências na aplicação</w:t>
-      </w:r>
-      <w:r>
-        <w:t xml:space="preserve"> (</w:t>
-      </w:r>
-      <w:r>
-        <w:t>HATMA</w:t>
-      </w:r>
-      <w:r>
-        <w:t xml:space="preserve">, 2017). Por esses motivos, Java Spring foi escolhido para construir o </w:t>
-      </w:r>
-      <w:proofErr w:type="spellStart"/>
-      <w:r>
-        <w:t>back-end</w:t>
-      </w:r>
-      <w:proofErr w:type="spellEnd"/>
-      <w:r>
-        <w:t xml:space="preserve"> do sistema.</w:t>
-      </w:r>
-    </w:p>
-    <w:p/>
-    <w:p>
-      <w:pPr>
-        <w:pStyle w:val="Ttulo4"/>
-      </w:pPr>
-      <w:r>
-        <w:t xml:space="preserve"> </w:t>
-      </w:r>
-      <w:proofErr w:type="spellStart"/>
-      <w:r>
-        <w:t>ReactJS</w:t>
-      </w:r>
-      <w:proofErr w:type="spellEnd"/>
-    </w:p>
-    <w:p>
-      <w:r>
-        <w:t xml:space="preserve">O </w:t>
-      </w:r>
-      <w:proofErr w:type="spellStart"/>
-      <w:r>
-        <w:t>ReactJS</w:t>
-      </w:r>
-      <w:proofErr w:type="spellEnd"/>
-      <w:r>
-        <w:t xml:space="preserve">, ou só </w:t>
-      </w:r>
-      <w:proofErr w:type="spellStart"/>
-      <w:r>
-        <w:t>React</w:t>
-      </w:r>
-      <w:proofErr w:type="spellEnd"/>
-      <w:r>
-        <w:t>,</w:t>
-      </w:r>
-      <w:r>
-        <w:t xml:space="preserve"> é uma biblioteca de código aberto que é utilizada para construir interfaces de usuário</w:t>
-      </w:r>
-      <w:r>
-        <w:t>.</w:t>
-      </w:r>
-      <w:r>
-        <w:t xml:space="preserve"> O </w:t>
-      </w:r>
-      <w:proofErr w:type="spellStart"/>
-      <w:r>
-        <w:t>Reac</w:t>
-      </w:r>
-      <w:r>
-        <w:t>t</w:t>
-      </w:r>
-      <w:proofErr w:type="spellEnd"/>
-      <w:r>
-        <w:t xml:space="preserve"> permite que programadores criem grandes aplicações web que podem mudar ao longo do tempo sem precisar recarregar a página</w:t>
-      </w:r>
-      <w:r>
-        <w:t xml:space="preserve">, resultando em uma navegação mais fluída para o usuário. </w:t>
-      </w:r>
-      <w:r>
-        <w:t>(</w:t>
-      </w:r>
-      <w:r>
-        <w:t>RAWAT</w:t>
-      </w:r>
-      <w:r>
-        <w:t xml:space="preserve">, </w:t>
-      </w:r>
-      <w:r>
-        <w:t>2020</w:t>
-      </w:r>
-      <w:r>
-        <w:t>)</w:t>
-      </w:r>
-    </w:p>
-    <w:p/>
-    <w:p>
-      <w:pPr>
-        <w:pStyle w:val="Ttulo3"/>
-      </w:pPr>
-      <w:r>
-        <w:t xml:space="preserve"> API</w:t>
-      </w:r>
-    </w:p>
-    <w:p>
-      <w:r>
-        <w:t xml:space="preserve">A comunicação entre o </w:t>
-      </w:r>
-      <w:proofErr w:type="spellStart"/>
-      <w:r>
-        <w:t>front-end</w:t>
-      </w:r>
-      <w:proofErr w:type="spellEnd"/>
-      <w:r>
-        <w:t xml:space="preserve"> da aplicação e o </w:t>
-      </w:r>
-      <w:proofErr w:type="spellStart"/>
-      <w:r>
-        <w:t>back-end</w:t>
-      </w:r>
-      <w:proofErr w:type="spellEnd"/>
-      <w:r>
-        <w:t>, assim como a comunicação com sistemas externos</w:t>
-      </w:r>
-      <w:r>
-        <w:t>, ocorre via API.</w:t>
-      </w:r>
-      <w:r>
-        <w:t xml:space="preserve"> </w:t>
-      </w:r>
-      <w:r>
-        <w:t>API significa interface de programação de aplicações. Uma API ajuda a expor um serviço de negócio ou um ativo empresarial para os desenvolvedores que estão criando uma aplicação</w:t>
-      </w:r>
-      <w:r>
-        <w:t xml:space="preserve"> (</w:t>
-      </w:r>
-      <w:r>
-        <w:t>DE</w:t>
-      </w:r>
-      <w:r>
-        <w:t xml:space="preserve">, 2017). </w:t>
-      </w:r>
-      <w:r>
-        <w:t>Uma interface pode ser entendida como um acordo de serviço entre duas aplicações, estabelecendo as regras para a comunicação entre elas por meio de solicitações e respostas. A documentação das respectivas APIs fornece detalhes sobre como os desenvolvedores devem organizar essas solicitações e respostas.</w:t>
-      </w:r>
-      <w:r>
-        <w:t xml:space="preserve"> (AMAZON, 2024).</w:t>
-      </w:r>
-    </w:p>
-    <w:p>
-      <w:pPr>
-        <w:pStyle w:val="Ttulo4"/>
-      </w:pPr>
-      <w:r>
-        <w:t xml:space="preserve"> HTTP</w:t>
-      </w:r>
-    </w:p>
-    <w:p>
-      <w:pPr>
-        <w:pStyle w:val="Ttulo4"/>
-      </w:pPr>
-      <w:r>
-        <w:t xml:space="preserve"> REST</w:t>
-      </w:r>
-    </w:p>
-    <w:p>
-      <w:pPr>
-        <w:pStyle w:val="Ttulo4"/>
-      </w:pPr>
-      <w:r>
-        <w:t xml:space="preserve"> API mapa</w:t>
-      </w:r>
-    </w:p>
-    <w:p/>
-    <w:p>
-      <w:pPr>
         <w:spacing w:line="240" w:lineRule="auto"/>
         <w:ind w:firstLine="0"/>
         <w:jc w:val="left"/>
       </w:pPr>
       <w:r>
         <w:tab/>
-      </w:r>
-      <w:r>
-        <w:tab/>
-        <w:t xml:space="preserve">2. </w:t>
-      </w:r>
-      <w:proofErr w:type="spellStart"/>
-      <w:r>
-        <w:t>react</w:t>
-      </w:r>
-      <w:proofErr w:type="spellEnd"/>
-    </w:p>
-    <w:p>
-      <w:pPr>
-        <w:spacing w:line="240" w:lineRule="auto"/>
-        <w:ind w:firstLine="0"/>
-        <w:jc w:val="left"/>
-      </w:pPr>
-      <w:r>
-        <w:tab/>
-        <w:t>6. (além dos frameworks, além do interno) API</w:t>
-      </w:r>
-    </w:p>
-    <w:p>
-      <w:pPr>
-        <w:spacing w:line="240" w:lineRule="auto"/>
-        <w:ind w:firstLine="0"/>
-        <w:jc w:val="left"/>
-      </w:pPr>
-      <w:r>
-        <w:lastRenderedPageBreak/>
-        <w:tab/>
-        <w:t>7. (para se comunicar com API) REST</w:t>
-      </w:r>
-    </w:p>
-    <w:p>
-      <w:pPr>
-        <w:spacing w:line="240" w:lineRule="auto"/>
-        <w:ind w:firstLine="0"/>
-        <w:jc w:val="left"/>
-      </w:pPr>
-      <w:r>
-        <w:tab/>
-      </w:r>
-      <w:r>
-        <w:tab/>
-        <w:t>1. externo, interno</w:t>
-      </w:r>
-    </w:p>
-    <w:p>
-      <w:pPr>
-        <w:spacing w:line="240" w:lineRule="auto"/>
-        <w:ind w:firstLine="0"/>
-        <w:jc w:val="left"/>
-      </w:pPr>
-      <w:r>
-        <w:tab/>
-        <w:t>8. (</w:t>
-      </w:r>
-      <w:proofErr w:type="spellStart"/>
-      <w:r>
-        <w:t>hmm</w:t>
-      </w:r>
-      <w:proofErr w:type="spellEnd"/>
-      <w:r>
-        <w:t>) testes</w:t>
+        <w:t>8. (hmm) testes</w:t>
       </w:r>
     </w:p>
     <w:p>
@@ -5982,13 +5805,8 @@
       </w:r>
       <w:r>
         <w:tab/>
-        <w:t xml:space="preserve">3. o testador do </w:t>
-      </w:r>
-      <w:proofErr w:type="spellStart"/>
-      <w:r>
-        <w:t>spring</w:t>
-      </w:r>
-      <w:proofErr w:type="spellEnd"/>
+        <w:t>3. o testador do spring</w:t>
+      </w:r>
     </w:p>
     <w:p>
       <w:pPr>
@@ -5998,15 +5816,7 @@
       </w:pPr>
       <w:r>
         <w:tab/>
-        <w:t xml:space="preserve">9. (tendo tudo definido, lugar pra </w:t>
-      </w:r>
-      <w:proofErr w:type="spellStart"/>
-      <w:r>
-        <w:t>versionar</w:t>
-      </w:r>
-      <w:proofErr w:type="spellEnd"/>
-      <w:r>
-        <w:t>) GIT</w:t>
+        <w:t>9. (tendo tudo definido, lugar pra versionar) GIT</w:t>
       </w:r>
     </w:p>
     <w:p>
@@ -6020,21 +5830,8 @@
       </w:r>
       <w:r>
         <w:tab/>
-        <w:t xml:space="preserve">1. </w:t>
-      </w:r>
-      <w:proofErr w:type="spellStart"/>
-      <w:r>
-        <w:t>git</w:t>
-      </w:r>
-      <w:proofErr w:type="spellEnd"/>
-      <w:r>
-        <w:t>/</w:t>
-      </w:r>
-      <w:proofErr w:type="spellStart"/>
-      <w:r>
-        <w:t>github</w:t>
-      </w:r>
-      <w:proofErr w:type="spellEnd"/>
+        <w:t>1. git/github</w:t>
+      </w:r>
       <w:r>
         <w:br w:type="page"/>
       </w:r>
@@ -6651,15 +6448,23 @@
     </w:p>
     <w:p>
       <w:pPr>
-        <w:rPr>
-          <w:szCs w:val="24"/>
-        </w:rPr>
-      </w:pPr>
-      <w:r>
-        <w:rPr>
-          <w:szCs w:val="24"/>
-        </w:rPr>
+        <w:pStyle w:val="Ttulo1"/>
+      </w:pPr>
+      <w:r>
         <w:lastRenderedPageBreak/>
+        <w:t>RASCUNHO BIBLIOGRAFIA</w:t>
+      </w:r>
+    </w:p>
+    <w:p>
+      <w:pPr>
+        <w:rPr>
+          <w:szCs w:val="24"/>
+        </w:rPr>
+      </w:pPr>
+      <w:r>
+        <w:rPr>
+          <w:szCs w:val="24"/>
+        </w:rPr>
         <w:t xml:space="preserve">LENOVO. </w:t>
       </w:r>
       <w:r>
@@ -6723,21 +6528,7 @@
         <w:rPr>
           <w:szCs w:val="24"/>
         </w:rPr>
-        <w:t xml:space="preserve">. </w:t>
-      </w:r>
-      <w:proofErr w:type="spellStart"/>
-      <w:r>
-        <w:rPr>
-          <w:szCs w:val="24"/>
-        </w:rPr>
-        <w:t>TechTarget</w:t>
-      </w:r>
-      <w:proofErr w:type="spellEnd"/>
-      <w:r>
-        <w:rPr>
-          <w:szCs w:val="24"/>
-        </w:rPr>
-        <w:t xml:space="preserve">. </w:t>
+        <w:t xml:space="preserve">. TechTarget. </w:t>
       </w:r>
       <w:r>
         <w:rPr>
@@ -6875,35 +6666,7 @@
         <w:rPr>
           <w:szCs w:val="24"/>
         </w:rPr>
-        <w:t>Brooks, Chad. "</w:t>
-      </w:r>
-      <w:proofErr w:type="spellStart"/>
-      <w:r>
-        <w:rPr>
-          <w:szCs w:val="24"/>
-        </w:rPr>
-        <w:t>What</w:t>
-      </w:r>
-      <w:proofErr w:type="spellEnd"/>
-      <w:r>
-        <w:rPr>
-          <w:szCs w:val="24"/>
-        </w:rPr>
-        <w:t xml:space="preserve"> </w:t>
-      </w:r>
-      <w:proofErr w:type="spellStart"/>
-      <w:r>
-        <w:rPr>
-          <w:szCs w:val="24"/>
-        </w:rPr>
-        <w:t>Is</w:t>
-      </w:r>
-      <w:proofErr w:type="spellEnd"/>
-      <w:r>
-        <w:rPr>
-          <w:szCs w:val="24"/>
-        </w:rPr>
-        <w:t xml:space="preserve"> SQL?". </w:t>
+        <w:t xml:space="preserve">Brooks, Chad. "What Is SQL?". </w:t>
       </w:r>
       <w:r>
         <w:rPr>
@@ -6937,48 +6700,20 @@
         <w:rPr>
           <w:szCs w:val="24"/>
         </w:rPr>
-        <w:t xml:space="preserve">MILANI, André. MySQL: guia do programador. São Paulo: </w:t>
-      </w:r>
-      <w:proofErr w:type="spellStart"/>
-      <w:r>
-        <w:rPr>
-          <w:szCs w:val="24"/>
-        </w:rPr>
-        <w:t>Novatec</w:t>
-      </w:r>
-      <w:proofErr w:type="spellEnd"/>
-      <w:r>
-        <w:rPr>
-          <w:szCs w:val="24"/>
-        </w:rPr>
-        <w:t xml:space="preserve"> Editora, 2006. ISBN 85-7522-103-5.</w:t>
-      </w:r>
-    </w:p>
-    <w:p>
-      <w:pPr>
-        <w:rPr>
-          <w:szCs w:val="24"/>
-        </w:rPr>
-      </w:pPr>
-      <w:r>
-        <w:rPr>
-          <w:szCs w:val="24"/>
-        </w:rPr>
-        <w:t xml:space="preserve">ANA CRISTINA VIEIRA DE MELO, F. S. C. </w:t>
-      </w:r>
-      <w:proofErr w:type="spellStart"/>
-      <w:r>
-        <w:rPr>
-          <w:szCs w:val="24"/>
-        </w:rPr>
-        <w:t>da</w:t>
-      </w:r>
-      <w:proofErr w:type="spellEnd"/>
-      <w:r>
-        <w:rPr>
-          <w:szCs w:val="24"/>
-        </w:rPr>
-        <w:t xml:space="preserve"> S. </w:t>
+        <w:t>MILANI, André. MySQL: guia do programador. São Paulo: Novatec Editora, 2006. ISBN 85-7522-103-5.</w:t>
+      </w:r>
+    </w:p>
+    <w:p>
+      <w:pPr>
+        <w:rPr>
+          <w:szCs w:val="24"/>
+        </w:rPr>
+      </w:pPr>
+      <w:r>
+        <w:rPr>
+          <w:szCs w:val="24"/>
+        </w:rPr>
+        <w:t>ANA CRISTINA VIEIRA DE MELO, F. S. C. da S. </w:t>
       </w:r>
       <w:r>
         <w:rPr>
@@ -6992,35 +6727,7 @@
         <w:rPr>
           <w:szCs w:val="24"/>
         </w:rPr>
-        <w:t xml:space="preserve">. </w:t>
-      </w:r>
-      <w:proofErr w:type="spellStart"/>
-      <w:r>
-        <w:rPr>
-          <w:szCs w:val="24"/>
-        </w:rPr>
-        <w:t>São</w:t>
-      </w:r>
-      <w:proofErr w:type="spellEnd"/>
-      <w:r>
-        <w:rPr>
-          <w:szCs w:val="24"/>
-        </w:rPr>
-        <w:t xml:space="preserve"> Paulo, SP, Brasil: </w:t>
-      </w:r>
-      <w:proofErr w:type="spellStart"/>
-      <w:r>
-        <w:rPr>
-          <w:szCs w:val="24"/>
-        </w:rPr>
-        <w:t>Blucher</w:t>
-      </w:r>
-      <w:proofErr w:type="spellEnd"/>
-      <w:r>
-        <w:rPr>
-          <w:szCs w:val="24"/>
-        </w:rPr>
-        <w:t>, 2003. ISBN 9788521214922. Disponível em: https://search.ebscohost.com/login.aspx?direct=true&amp;db=nlebk&amp;AN=2202168&amp;lang=pt-br&amp;site=ehost-live. Acesso em: 1 set. 2024.</w:t>
+        <w:t>. São Paulo, SP, Brasil: Blucher, 2003. ISBN 9788521214922. Disponível em: https://search.ebscohost.com/login.aspx?direct=true&amp;db=nlebk&amp;AN=2202168&amp;lang=pt-br&amp;site=ehost-live. Acesso em: 1 set. 2024.</w:t>
       </w:r>
     </w:p>
     <w:p>
@@ -7183,39 +6890,7 @@
           <w:szCs w:val="24"/>
           <w:lang w:val="en-US"/>
         </w:rPr>
-        <w:t xml:space="preserve">São Paulo: </w:t>
-      </w:r>
-      <w:proofErr w:type="spellStart"/>
-      <w:r>
-        <w:rPr>
-          <w:szCs w:val="24"/>
-          <w:lang w:val="en-US"/>
-        </w:rPr>
-        <w:t>Novatec</w:t>
-      </w:r>
-      <w:proofErr w:type="spellEnd"/>
-      <w:r>
-        <w:rPr>
-          <w:szCs w:val="24"/>
-          <w:lang w:val="en-US"/>
-        </w:rPr>
-        <w:t xml:space="preserve"> </w:t>
-      </w:r>
-      <w:proofErr w:type="spellStart"/>
-      <w:r>
-        <w:rPr>
-          <w:szCs w:val="24"/>
-          <w:lang w:val="en-US"/>
-        </w:rPr>
-        <w:t>Editora</w:t>
-      </w:r>
-      <w:proofErr w:type="spellEnd"/>
-      <w:r>
-        <w:rPr>
-          <w:szCs w:val="24"/>
-          <w:lang w:val="en-US"/>
-        </w:rPr>
-        <w:t>, 2008.</w:t>
+        <w:t>São Paulo: Novatec Editora, 2008.</w:t>
       </w:r>
     </w:p>
     <w:p>
@@ -7269,43 +6944,19 @@
         </w:rPr>
         <w:t xml:space="preserve">. </w:t>
       </w:r>
-      <w:proofErr w:type="spellStart"/>
       <w:r>
         <w:rPr>
           <w:szCs w:val="24"/>
           <w:lang w:val="en-US"/>
         </w:rPr>
-        <w:t>Acesso</w:t>
-      </w:r>
-      <w:proofErr w:type="spellEnd"/>
-      <w:r>
+        <w:t>Acesso em: 2 set. 2024.</w:t>
+      </w:r>
+    </w:p>
+    <w:p>
+      <w:pPr>
         <w:rPr>
           <w:szCs w:val="24"/>
           <w:lang w:val="en-US"/>
-        </w:rPr>
-        <w:t xml:space="preserve"> </w:t>
-      </w:r>
-      <w:proofErr w:type="spellStart"/>
-      <w:r>
-        <w:rPr>
-          <w:szCs w:val="24"/>
-          <w:lang w:val="en-US"/>
-        </w:rPr>
-        <w:t>em</w:t>
-      </w:r>
-      <w:proofErr w:type="spellEnd"/>
-      <w:r>
-        <w:rPr>
-          <w:szCs w:val="24"/>
-          <w:lang w:val="en-US"/>
-        </w:rPr>
-        <w:t>: 2 set. 2024.</w:t>
-      </w:r>
-    </w:p>
-    <w:p>
-      <w:pPr>
-        <w:rPr>
-          <w:szCs w:val="24"/>
         </w:rPr>
       </w:pPr>
       <w:r>
@@ -7320,12 +6971,14 @@
           <w:i/>
           <w:iCs/>
           <w:szCs w:val="24"/>
+          <w:lang w:val="en-US"/>
         </w:rPr>
         <w:t>Procedia Computer Science</w:t>
       </w:r>
       <w:r>
         <w:rPr>
           <w:szCs w:val="24"/>
+          <w:lang w:val="en-US"/>
         </w:rPr>
         <w:t>, v. 124, p. 736-743, 2017.</w:t>
       </w:r>
@@ -7357,23 +7010,7 @@
           <w:szCs w:val="24"/>
           <w:lang w:val="en-US"/>
         </w:rPr>
-        <w:t xml:space="preserve">, v. 5, n. 11, p. 698, </w:t>
-      </w:r>
-      <w:proofErr w:type="spellStart"/>
-      <w:r>
-        <w:rPr>
-          <w:szCs w:val="24"/>
-          <w:lang w:val="en-US"/>
-        </w:rPr>
-        <w:t>nov.</w:t>
-      </w:r>
-      <w:proofErr w:type="spellEnd"/>
-      <w:r>
-        <w:rPr>
-          <w:szCs w:val="24"/>
-          <w:lang w:val="en-US"/>
-        </w:rPr>
-        <w:t xml:space="preserve"> 2020. </w:t>
+        <w:t xml:space="preserve">, v. 5, n. 11, p. 698, nov. 2020. </w:t>
       </w:r>
       <w:r>
         <w:rPr>
@@ -7407,21 +7044,7 @@
         <w:rPr>
           <w:szCs w:val="24"/>
         </w:rPr>
-        <w:t xml:space="preserve">AMAZON WEB SERVICES. O que é uma </w:t>
-      </w:r>
-      <w:proofErr w:type="gramStart"/>
-      <w:r>
-        <w:rPr>
-          <w:szCs w:val="24"/>
-        </w:rPr>
-        <w:t>API?.</w:t>
-      </w:r>
-      <w:proofErr w:type="gramEnd"/>
-      <w:r>
-        <w:rPr>
-          <w:szCs w:val="24"/>
-        </w:rPr>
-        <w:t xml:space="preserve"> Disponível em: </w:t>
+        <w:t xml:space="preserve">AMAZON WEB SERVICES. O que é uma API?. Disponível em: </w:t>
       </w:r>
       <w:hyperlink r:id="rId29" w:tgtFrame="_new" w:history="1">
         <w:r>
@@ -7439,9 +7062,251 @@
         <w:t>. Acesso em: 3 set. 2024.</w:t>
       </w:r>
     </w:p>
+    <w:p>
+      <w:pPr>
+        <w:rPr>
+          <w:szCs w:val="24"/>
+        </w:rPr>
+      </w:pPr>
+      <w:r>
+        <w:rPr>
+          <w:szCs w:val="24"/>
+        </w:rPr>
+        <w:t xml:space="preserve">RED HAT. </w:t>
+      </w:r>
+      <w:r>
+        <w:rPr>
+          <w:i/>
+          <w:iCs/>
+          <w:szCs w:val="24"/>
+        </w:rPr>
+        <w:t>O que é uma API REST?</w:t>
+      </w:r>
+      <w:r>
+        <w:rPr>
+          <w:szCs w:val="24"/>
+        </w:rPr>
+        <w:t xml:space="preserve"> Disponível em: </w:t>
+      </w:r>
+      <w:hyperlink r:id="rId30" w:tgtFrame="_new" w:history="1">
+        <w:r>
+          <w:rPr>
+            <w:rStyle w:val="Hyperlink"/>
+            <w:szCs w:val="24"/>
+          </w:rPr>
+          <w:t>https://www.redhat.com/pt-br/topics/api/what-is-a-rest-api</w:t>
+        </w:r>
+      </w:hyperlink>
+      <w:r>
+        <w:rPr>
+          <w:szCs w:val="24"/>
+        </w:rPr>
+        <w:t>. Acesso em: 4 set. 2024.</w:t>
+      </w:r>
+    </w:p>
+    <w:p>
+      <w:pPr>
+        <w:rPr>
+          <w:szCs w:val="24"/>
+        </w:rPr>
+      </w:pPr>
+      <w:r>
+        <w:rPr>
+          <w:szCs w:val="24"/>
+        </w:rPr>
+        <w:t xml:space="preserve">IBM. </w:t>
+      </w:r>
+      <w:r>
+        <w:rPr>
+          <w:i/>
+          <w:iCs/>
+          <w:szCs w:val="24"/>
+        </w:rPr>
+        <w:t>REST APIs</w:t>
+      </w:r>
+      <w:r>
+        <w:rPr>
+          <w:szCs w:val="24"/>
+        </w:rPr>
+        <w:t xml:space="preserve">. Disponível em: </w:t>
+      </w:r>
+      <w:hyperlink r:id="rId31" w:tgtFrame="_new" w:history="1">
+        <w:r>
+          <w:rPr>
+            <w:rStyle w:val="Hyperlink"/>
+            <w:szCs w:val="24"/>
+          </w:rPr>
+          <w:t>https://www.ibm.com/br-pt/topics/rest-apis</w:t>
+        </w:r>
+      </w:hyperlink>
+      <w:r>
+        <w:rPr>
+          <w:szCs w:val="24"/>
+        </w:rPr>
+        <w:t>. Acesso em: 4 set. 2024.</w:t>
+      </w:r>
+    </w:p>
+    <w:p>
+      <w:pPr>
+        <w:rPr>
+          <w:szCs w:val="24"/>
+        </w:rPr>
+      </w:pPr>
+      <w:r>
+        <w:rPr>
+          <w:szCs w:val="24"/>
+          <w:lang w:val="en-US"/>
+        </w:rPr>
+        <w:t xml:space="preserve">OPENSTREETMAP. </w:t>
+      </w:r>
+      <w:r>
+        <w:rPr>
+          <w:i/>
+          <w:iCs/>
+          <w:szCs w:val="24"/>
+          <w:lang w:val="en-US"/>
+        </w:rPr>
+        <w:t>About OpenStreetMap</w:t>
+      </w:r>
+      <w:r>
+        <w:rPr>
+          <w:szCs w:val="24"/>
+          <w:lang w:val="en-US"/>
+        </w:rPr>
+        <w:t xml:space="preserve">. Disponível em: </w:t>
+      </w:r>
+      <w:hyperlink r:id="rId32" w:tgtFrame="_new" w:history="1">
+        <w:r>
+          <w:rPr>
+            <w:rStyle w:val="Hyperlink"/>
+            <w:szCs w:val="24"/>
+            <w:lang w:val="en-US"/>
+          </w:rPr>
+          <w:t>https://www.openstreetmap.org/about</w:t>
+        </w:r>
+      </w:hyperlink>
+      <w:r>
+        <w:rPr>
+          <w:szCs w:val="24"/>
+          <w:lang w:val="en-US"/>
+        </w:rPr>
+        <w:t xml:space="preserve">. </w:t>
+      </w:r>
+      <w:r>
+        <w:rPr>
+          <w:szCs w:val="24"/>
+        </w:rPr>
+        <w:t>Acesso em: 08 set. 2024</w:t>
+      </w:r>
+    </w:p>
+    <w:p>
+      <w:pPr>
+        <w:rPr>
+          <w:szCs w:val="24"/>
+        </w:rPr>
+      </w:pPr>
+      <w:r>
+        <w:rPr>
+          <w:szCs w:val="24"/>
+          <w:lang w:val="en-US"/>
+        </w:rPr>
+        <w:t xml:space="preserve">HAKLAY, Mordechai (Muki); WEBER, Patrick. OpenStreetMap: User-Generated Street Maps. </w:t>
+      </w:r>
+      <w:r>
+        <w:rPr>
+          <w:i/>
+          <w:iCs/>
+          <w:szCs w:val="24"/>
+        </w:rPr>
+        <w:t>IEEE Pervasive Computing</w:t>
+      </w:r>
+      <w:r>
+        <w:rPr>
+          <w:szCs w:val="24"/>
+        </w:rPr>
+        <w:t>, v. 7, p. 12-18, 2008.</w:t>
+      </w:r>
+    </w:p>
+    <w:p>
+      <w:pPr>
+        <w:rPr>
+          <w:szCs w:val="24"/>
+        </w:rPr>
+      </w:pPr>
+      <w:r>
+        <w:rPr>
+          <w:szCs w:val="24"/>
+        </w:rPr>
+        <w:t xml:space="preserve">MAPTILER. </w:t>
+      </w:r>
+      <w:r>
+        <w:rPr>
+          <w:i/>
+          <w:iCs/>
+          <w:szCs w:val="24"/>
+        </w:rPr>
+        <w:t>Copyright</w:t>
+      </w:r>
+      <w:r>
+        <w:rPr>
+          <w:szCs w:val="24"/>
+        </w:rPr>
+        <w:t xml:space="preserve">. Disponível em: </w:t>
+      </w:r>
+      <w:hyperlink r:id="rId33" w:tgtFrame="_new" w:history="1">
+        <w:r>
+          <w:rPr>
+            <w:rStyle w:val="Hyperlink"/>
+            <w:szCs w:val="24"/>
+          </w:rPr>
+          <w:t>https://www.maptiler.com/copyright/</w:t>
+        </w:r>
+      </w:hyperlink>
+      <w:r>
+        <w:rPr>
+          <w:szCs w:val="24"/>
+        </w:rPr>
+        <w:t>. Acesso em: 8 set. 2024.</w:t>
+      </w:r>
+    </w:p>
+    <w:p>
+      <w:pPr>
+        <w:rPr>
+          <w:szCs w:val="24"/>
+        </w:rPr>
+      </w:pPr>
+      <w:r>
+        <w:rPr>
+          <w:szCs w:val="24"/>
+          <w:lang w:val="en-US"/>
+        </w:rPr>
+        <w:t xml:space="preserve">LEAFLET. Leaflet: a JavaScript library for interactive maps. </w:t>
+      </w:r>
+      <w:r>
+        <w:rPr>
+          <w:szCs w:val="24"/>
+        </w:rPr>
+        <w:t xml:space="preserve">2023. Disponível em: </w:t>
+      </w:r>
+      <w:hyperlink r:id="rId34" w:tgtFrame="_new" w:history="1">
+        <w:r>
+          <w:rPr>
+            <w:rStyle w:val="Hyperlink"/>
+            <w:szCs w:val="24"/>
+          </w:rPr>
+          <w:t>https://leafletjs.com/</w:t>
+        </w:r>
+      </w:hyperlink>
+      <w:r>
+        <w:rPr>
+          <w:szCs w:val="24"/>
+        </w:rPr>
+        <w:t>. Acesso em: 8 set. 2024.</w:t>
+      </w:r>
+    </w:p>
     <w:sectPr>
-      <w:headerReference w:type="even" r:id="rId30"/>
-      <w:headerReference w:type="default" r:id="rId31"/>
+      <w:headerReference w:type="even" r:id="rId35"/>
+      <w:headerReference w:type="default" r:id="rId36"/>
       <w:type w:val="oddPage"/>
       <w:pgSz w:w="11907" w:h="16840" w:code="9"/>
       <w:pgMar w:top="1701" w:right="1134" w:bottom="1134" w:left="1701" w:header="1134" w:footer="1134" w:gutter="0"/>
@@ -9922,6 +9787,7 @@
   <w:style w:type="character" w:default="1" w:styleId="Fontepargpadro">
     <w:name w:val="Default Paragraph Font"/>
     <w:uiPriority w:val="1"/>
+    <w:semiHidden/>
     <w:unhideWhenUsed/>
   </w:style>
   <w:style w:type="table" w:default="1" w:styleId="Tabelanormal">
@@ -10914,6 +10780,10 @@
 </file>
 
 <file path=customXml/item1.xml><?xml version="1.0" encoding="utf-8"?>
+<b:Sources xmlns:b="http://schemas.openxmlformats.org/officeDocument/2006/bibliography" xmlns="http://schemas.openxmlformats.org/officeDocument/2006/bibliography" SelectedStyle="\GB.XSL" StyleName="GB7714"/>
+</file>
+
+<file path=customXml/item2.xml><?xml version="1.0" encoding="utf-8"?>
 <?mso-contentType ?>
 <FormTemplates xmlns="http://schemas.microsoft.com/sharepoint/v3/contenttype/forms">
   <Display>DocumentLibraryForm</Display>
@@ -10922,11 +10792,17 @@
 </FormTemplates>
 </file>
 
-<file path=customXml/item2.xml><?xml version="1.0" encoding="utf-8"?>
-<b:Sources xmlns:b="http://schemas.openxmlformats.org/officeDocument/2006/bibliography" xmlns="http://schemas.openxmlformats.org/officeDocument/2006/bibliography" SelectedStyle="\GB.XSL" StyleName="GB7714"/>
+<file path=customXml/item3.xml><?xml version="1.0" encoding="utf-8"?>
+<p:properties xmlns:p="http://schemas.microsoft.com/office/2006/metadata/properties" xmlns:xsi="http://www.w3.org/2001/XMLSchema-instance" xmlns:pc="http://schemas.microsoft.com/office/infopath/2007/PartnerControls">
+  <documentManagement>
+    <_ip_UnifiedCompliancePolicyUIAction xmlns="http://schemas.microsoft.com/sharepoint/v3" xsi:nil="true"/>
+    <_ip_UnifiedCompliancePolicyProperties xmlns="http://schemas.microsoft.com/sharepoint/v3" xsi:nil="true"/>
+    <_activity xmlns="dc236bd3-22a1-40fd-b120-f4bf2cfb02e5" xsi:nil="true"/>
+  </documentManagement>
+</p:properties>
 </file>
 
-<file path=customXml/item3.xml><?xml version="1.0" encoding="utf-8"?>
+<file path=customXml/item4.xml><?xml version="1.0" encoding="utf-8"?>
 <ct:contentTypeSchema xmlns:ct="http://schemas.microsoft.com/office/2006/metadata/contentType" xmlns:ma="http://schemas.microsoft.com/office/2006/metadata/properties/metaAttributes" ct:_="" ma:_="" ma:contentTypeName="Documento" ma:contentTypeID="0x0101009A9245E7D933DB48BB9689B768D8465E" ma:contentTypeVersion="20" ma:contentTypeDescription="Crie um novo documento." ma:contentTypeScope="" ma:versionID="c310dbd2fa624fda04c8bc918a8b03ac">
   <xsd:schema xmlns:xsd="http://www.w3.org/2001/XMLSchema" xmlns:xs="http://www.w3.org/2001/XMLSchema" xmlns:p="http://schemas.microsoft.com/office/2006/metadata/properties" xmlns:ns1="http://schemas.microsoft.com/sharepoint/v3" xmlns:ns3="dc236bd3-22a1-40fd-b120-f4bf2cfb02e5" xmlns:ns4="9d3905d4-f008-4ae0-8ecf-c0fcf643c7ce" targetNamespace="http://schemas.microsoft.com/office/2006/metadata/properties" ma:root="true" ma:fieldsID="12efab61f20a256d51c72f88e5f31734" ns1:_="" ns3:_="" ns4:_="">
     <xsd:import namespace="http://schemas.microsoft.com/sharepoint/v3"/>
@@ -11196,17 +11072,15 @@
 </ct:contentTypeSchema>
 </file>
 
-<file path=customXml/item4.xml><?xml version="1.0" encoding="utf-8"?>
-<p:properties xmlns:p="http://schemas.microsoft.com/office/2006/metadata/properties" xmlns:xsi="http://www.w3.org/2001/XMLSchema-instance" xmlns:pc="http://schemas.microsoft.com/office/infopath/2007/PartnerControls">
-  <documentManagement>
-    <_ip_UnifiedCompliancePolicyUIAction xmlns="http://schemas.microsoft.com/sharepoint/v3" xsi:nil="true"/>
-    <_ip_UnifiedCompliancePolicyProperties xmlns="http://schemas.microsoft.com/sharepoint/v3" xsi:nil="true"/>
-    <_activity xmlns="dc236bd3-22a1-40fd-b120-f4bf2cfb02e5" xsi:nil="true"/>
-  </documentManagement>
-</p:properties>
+<file path=customXml/itemProps1.xml><?xml version="1.0" encoding="utf-8"?>
+<ds:datastoreItem xmlns:ds="http://schemas.openxmlformats.org/officeDocument/2006/customXml" ds:itemID="{D5E71C61-0628-4013-9296-50A26E5B5C0D}">
+  <ds:schemaRefs>
+    <ds:schemaRef ds:uri="http://schemas.openxmlformats.org/officeDocument/2006/bibliography"/>
+  </ds:schemaRefs>
+</ds:datastoreItem>
 </file>
 
-<file path=customXml/itemProps1.xml><?xml version="1.0" encoding="utf-8"?>
+<file path=customXml/itemProps2.xml><?xml version="1.0" encoding="utf-8"?>
 <ds:datastoreItem xmlns:ds="http://schemas.openxmlformats.org/officeDocument/2006/customXml" ds:itemID="{D0EF6655-36F8-4AE8-80E8-8843D0BE3BB0}">
   <ds:schemaRefs>
     <ds:schemaRef ds:uri="http://schemas.microsoft.com/sharepoint/v3/contenttype/forms"/>
@@ -11214,15 +11088,25 @@
 </ds:datastoreItem>
 </file>
 
-<file path=customXml/itemProps2.xml><?xml version="1.0" encoding="utf-8"?>
-<ds:datastoreItem xmlns:ds="http://schemas.openxmlformats.org/officeDocument/2006/customXml" ds:itemID="{D5E71C61-0628-4013-9296-50A26E5B5C0D}">
+<file path=customXml/itemProps3.xml><?xml version="1.0" encoding="utf-8"?>
+<ds:datastoreItem xmlns:ds="http://schemas.openxmlformats.org/officeDocument/2006/customXml" ds:itemID="{74AD157C-1D73-4DC2-B2B5-0CA82C9C3AED}">
   <ds:schemaRefs>
-    <ds:schemaRef ds:uri="http://schemas.openxmlformats.org/officeDocument/2006/bibliography"/>
+    <ds:schemaRef ds:uri="http://purl.org/dc/elements/1.1/"/>
+    <ds:schemaRef ds:uri="http://schemas.microsoft.com/office/2006/metadata/properties"/>
+    <ds:schemaRef ds:uri="http://schemas.microsoft.com/office/infopath/2007/PartnerControls"/>
+    <ds:schemaRef ds:uri="9d3905d4-f008-4ae0-8ecf-c0fcf643c7ce"/>
+    <ds:schemaRef ds:uri="http://schemas.openxmlformats.org/package/2006/metadata/core-properties"/>
+    <ds:schemaRef ds:uri="http://schemas.microsoft.com/office/2006/documentManagement/types"/>
+    <ds:schemaRef ds:uri="http://schemas.microsoft.com/sharepoint/v3"/>
+    <ds:schemaRef ds:uri="http://purl.org/dc/dcmitype/"/>
+    <ds:schemaRef ds:uri="dc236bd3-22a1-40fd-b120-f4bf2cfb02e5"/>
+    <ds:schemaRef ds:uri="http://www.w3.org/XML/1998/namespace"/>
+    <ds:schemaRef ds:uri="http://purl.org/dc/terms/"/>
   </ds:schemaRefs>
 </ds:datastoreItem>
 </file>
 
-<file path=customXml/itemProps3.xml><?xml version="1.0" encoding="utf-8"?>
+<file path=customXml/itemProps4.xml><?xml version="1.0" encoding="utf-8"?>
 <ds:datastoreItem xmlns:ds="http://schemas.openxmlformats.org/officeDocument/2006/customXml" ds:itemID="{9F3B7632-F9B1-4F20-B6CF-16E183EBD773}">
   <ds:schemaRefs>
     <ds:schemaRef ds:uri="http://schemas.microsoft.com/office/2006/metadata/contentType"/>
@@ -11240,22 +11124,4 @@
     <ds:schemaRef ds:uri="http://schemas.microsoft.com/internal/obd"/>
   </ds:schemaRefs>
 </ds:datastoreItem>
-</file>
-
-<file path=customXml/itemProps4.xml><?xml version="1.0" encoding="utf-8"?>
-<ds:datastoreItem xmlns:ds="http://schemas.openxmlformats.org/officeDocument/2006/customXml" ds:itemID="{74AD157C-1D73-4DC2-B2B5-0CA82C9C3AED}">
-  <ds:schemaRefs>
-    <ds:schemaRef ds:uri="http://purl.org/dc/elements/1.1/"/>
-    <ds:schemaRef ds:uri="http://schemas.microsoft.com/office/2006/documentManagement/types"/>
-    <ds:schemaRef ds:uri="http://schemas.openxmlformats.org/package/2006/metadata/core-properties"/>
-    <ds:schemaRef ds:uri="http://schemas.microsoft.com/office/2006/metadata/properties"/>
-    <ds:schemaRef ds:uri="http://schemas.microsoft.com/office/infopath/2007/PartnerControls"/>
-    <ds:schemaRef ds:uri="http://purl.org/dc/terms/"/>
-    <ds:schemaRef ds:uri="9d3905d4-f008-4ae0-8ecf-c0fcf643c7ce"/>
-    <ds:schemaRef ds:uri="http://purl.org/dc/dcmitype/"/>
-    <ds:schemaRef ds:uri="http://www.w3.org/XML/1998/namespace"/>
-    <ds:schemaRef ds:uri="dc236bd3-22a1-40fd-b120-f4bf2cfb02e5"/>
-    <ds:schemaRef ds:uri="http://schemas.microsoft.com/sharepoint/v3"/>
-  </ds:schemaRefs>
-</ds:datastoreItem>
 </file>
</xml_diff>